<commit_message>
organized python files in direcotories and added new Strategy Pattern
</commit_message>
<xml_diff>
--- a/python/p3_advanced_methods_of_python.docx
+++ b/python/p3_advanced_methods_of_python.docx
@@ -6,14 +6,14 @@
       <w:pPr>
         <w:jc w:val="center"/>
         <w:rPr>
-          <w:rFonts w:ascii="Calibri" w:hAnsi="Calibri" w:cs="Calibri"/>
-          <w:sz w:val="34"/>
-          <w:szCs w:val="34"/>
-        </w:rPr>
-      </w:pPr>
-      <w:r>
-        <w:rPr>
-          <w:rFonts w:ascii="Calibri" w:hAnsi="Calibri" w:cs="Calibri"/>
+          <w:rFonts w:ascii="Carlito" w:hAnsi="Carlito" w:cs="Carlito"/>
+          <w:sz w:val="34"/>
+          <w:szCs w:val="34"/>
+        </w:rPr>
+      </w:pPr>
+      <w:r>
+        <w:rPr>
+          <w:rFonts w:ascii="Carlito" w:hAnsi="Carlito" w:cs="Carlito"/>
           <w:b/>
           <w:bCs/>
           <w:sz w:val="42"/>
@@ -31,28 +31,44 @@
         </w:numPr>
         <w:jc w:val="both"/>
         <w:rPr>
-          <w:rFonts w:ascii="Calibri" w:hAnsi="Calibri" w:cs="Calibri"/>
-          <w:sz w:val="32"/>
-          <w:szCs w:val="32"/>
-        </w:rPr>
-      </w:pPr>
-      <w:r>
-        <w:rPr>
-          <w:rFonts w:ascii="Calibri" w:hAnsi="Calibri" w:cs="Calibri"/>
-          <w:b/>
-          <w:bCs/>
-          <w:sz w:val="32"/>
-          <w:szCs w:val="32"/>
+          <w:rFonts w:ascii="Carlito" w:hAnsi="Carlito" w:cs="Carlito"/>
+          <w:sz w:val="34"/>
+          <w:szCs w:val="34"/>
+        </w:rPr>
+      </w:pPr>
+      <w:r>
+        <w:rPr>
+          <w:rFonts w:ascii="Carlito" w:hAnsi="Carlito" w:cs="Carlito"/>
+          <w:b/>
+          <w:bCs/>
+          <w:sz w:val="34"/>
+          <w:szCs w:val="34"/>
         </w:rPr>
         <w:t>ASCII</w:t>
       </w:r>
       <w:r>
         <w:rPr>
-          <w:rFonts w:ascii="Calibri" w:hAnsi="Calibri" w:cs="Calibri"/>
-          <w:sz w:val="32"/>
-          <w:szCs w:val="32"/>
-        </w:rPr>
-        <w:t>…………………………………………………………………………………………….2</w:t>
+          <w:rFonts w:ascii="Carlito" w:hAnsi="Carlito" w:cs="Carlito"/>
+          <w:sz w:val="34"/>
+          <w:szCs w:val="34"/>
+        </w:rPr>
+        <w:t>……………………………………………</w:t>
+      </w:r>
+      <w:r>
+        <w:rPr>
+          <w:rFonts w:ascii="Carlito" w:hAnsi="Carlito" w:cs="Carlito"/>
+          <w:sz w:val="34"/>
+          <w:szCs w:val="34"/>
+        </w:rPr>
+        <w:t>.</w:t>
+      </w:r>
+      <w:r>
+        <w:rPr>
+          <w:rFonts w:ascii="Carlito" w:hAnsi="Carlito" w:cs="Carlito"/>
+          <w:sz w:val="34"/>
+          <w:szCs w:val="34"/>
+        </w:rPr>
+        <w:t>……………………………………….2</w:t>
       </w:r>
     </w:p>
     <w:p>
@@ -64,42 +80,58 @@
         </w:numPr>
         <w:jc w:val="both"/>
         <w:rPr>
-          <w:rFonts w:ascii="Calibri" w:hAnsi="Calibri" w:cs="Calibri"/>
-          <w:sz w:val="32"/>
-          <w:szCs w:val="32"/>
-        </w:rPr>
-      </w:pPr>
-      <w:r>
-        <w:rPr>
-          <w:rFonts w:ascii="Calibri" w:hAnsi="Calibri" w:cs="Calibri"/>
-          <w:b/>
-          <w:bCs/>
-          <w:sz w:val="32"/>
-          <w:szCs w:val="32"/>
+          <w:rFonts w:ascii="Carlito" w:hAnsi="Carlito" w:cs="Carlito"/>
+          <w:sz w:val="34"/>
+          <w:szCs w:val="34"/>
+        </w:rPr>
+      </w:pPr>
+      <w:r>
+        <w:rPr>
+          <w:rFonts w:ascii="Carlito" w:hAnsi="Carlito" w:cs="Carlito"/>
+          <w:b/>
+          <w:bCs/>
+          <w:sz w:val="34"/>
+          <w:szCs w:val="34"/>
         </w:rPr>
         <w:t>map()</w:t>
       </w:r>
       <w:r>
         <w:rPr>
-          <w:rFonts w:ascii="Calibri" w:hAnsi="Calibri" w:cs="Calibri"/>
-          <w:sz w:val="32"/>
-          <w:szCs w:val="32"/>
-        </w:rPr>
-        <w:t xml:space="preserve"> Function (loop alternative)…………..…………..……………</w:t>
-      </w:r>
-      <w:r>
-        <w:rPr>
-          <w:rFonts w:ascii="Calibri" w:hAnsi="Calibri" w:cs="Calibri"/>
-          <w:sz w:val="32"/>
-          <w:szCs w:val="32"/>
+          <w:rFonts w:ascii="Carlito" w:hAnsi="Carlito" w:cs="Carlito"/>
+          <w:sz w:val="34"/>
+          <w:szCs w:val="34"/>
+        </w:rPr>
+        <w:t xml:space="preserve"> Function (loop alternative)…………..…………..…</w:t>
+      </w:r>
+      <w:r>
+        <w:rPr>
+          <w:rFonts w:ascii="Carlito" w:hAnsi="Carlito" w:cs="Carlito"/>
+          <w:sz w:val="34"/>
+          <w:szCs w:val="34"/>
+        </w:rPr>
+        <w:t>.</w:t>
+      </w:r>
+      <w:r>
+        <w:rPr>
+          <w:rFonts w:ascii="Carlito" w:hAnsi="Carlito" w:cs="Carlito"/>
+          <w:sz w:val="34"/>
+          <w:szCs w:val="34"/>
+        </w:rPr>
+        <w:t>…</w:t>
+      </w:r>
+      <w:r>
+        <w:rPr>
+          <w:rFonts w:ascii="Carlito" w:hAnsi="Carlito" w:cs="Carlito"/>
+          <w:sz w:val="34"/>
+          <w:szCs w:val="34"/>
         </w:rPr>
         <w:t>………….</w:t>
       </w:r>
       <w:r>
         <w:rPr>
-          <w:rFonts w:ascii="Calibri" w:hAnsi="Calibri" w:cs="Calibri"/>
-          <w:sz w:val="32"/>
-          <w:szCs w:val="32"/>
+          <w:rFonts w:ascii="Carlito" w:hAnsi="Carlito" w:cs="Carlito"/>
+          <w:sz w:val="34"/>
+          <w:szCs w:val="34"/>
         </w:rPr>
         <w:t>.2</w:t>
       </w:r>
@@ -113,50 +145,50 @@
         </w:numPr>
         <w:jc w:val="both"/>
         <w:rPr>
-          <w:rFonts w:ascii="Calibri" w:hAnsi="Calibri" w:cs="Calibri"/>
-          <w:sz w:val="32"/>
-          <w:szCs w:val="32"/>
-        </w:rPr>
-      </w:pPr>
-      <w:r>
-        <w:rPr>
-          <w:rFonts w:ascii="Calibri" w:hAnsi="Calibri" w:cs="Calibri"/>
-          <w:b/>
-          <w:bCs/>
-          <w:sz w:val="32"/>
-          <w:szCs w:val="32"/>
+          <w:rFonts w:ascii="Carlito" w:hAnsi="Carlito" w:cs="Carlito"/>
+          <w:sz w:val="34"/>
+          <w:szCs w:val="34"/>
+        </w:rPr>
+      </w:pPr>
+      <w:r>
+        <w:rPr>
+          <w:rFonts w:ascii="Carlito" w:hAnsi="Carlito" w:cs="Carlito"/>
+          <w:b/>
+          <w:bCs/>
+          <w:sz w:val="34"/>
+          <w:szCs w:val="34"/>
         </w:rPr>
         <w:t xml:space="preserve">filter() </w:t>
       </w:r>
       <w:r>
         <w:rPr>
-          <w:rFonts w:ascii="Calibri" w:hAnsi="Calibri" w:cs="Calibri"/>
-          <w:sz w:val="32"/>
-          <w:szCs w:val="32"/>
+          <w:rFonts w:ascii="Carlito" w:hAnsi="Carlito" w:cs="Carlito"/>
+          <w:sz w:val="34"/>
+          <w:szCs w:val="34"/>
         </w:rPr>
         <w:t>Function…………………………………………………………</w:t>
       </w:r>
       <w:r>
         <w:rPr>
-          <w:rFonts w:ascii="Calibri" w:hAnsi="Calibri" w:cs="Calibri"/>
-          <w:sz w:val="32"/>
-          <w:szCs w:val="32"/>
-        </w:rPr>
-        <w:t>……………</w:t>
-      </w:r>
-      <w:r>
-        <w:rPr>
-          <w:rFonts w:ascii="Calibri" w:hAnsi="Calibri" w:cs="Calibri"/>
-          <w:sz w:val="32"/>
-          <w:szCs w:val="32"/>
+          <w:rFonts w:ascii="Carlito" w:hAnsi="Carlito" w:cs="Carlito"/>
+          <w:sz w:val="34"/>
+          <w:szCs w:val="34"/>
+        </w:rPr>
+        <w:t>………</w:t>
+      </w:r>
+      <w:r>
+        <w:rPr>
+          <w:rFonts w:ascii="Carlito" w:hAnsi="Carlito" w:cs="Carlito"/>
+          <w:sz w:val="34"/>
+          <w:szCs w:val="34"/>
         </w:rPr>
         <w:t>……</w:t>
       </w:r>
       <w:r>
         <w:rPr>
-          <w:rFonts w:ascii="Calibri" w:hAnsi="Calibri" w:cs="Calibri"/>
-          <w:sz w:val="32"/>
-          <w:szCs w:val="32"/>
+          <w:rFonts w:ascii="Carlito" w:hAnsi="Carlito" w:cs="Carlito"/>
+          <w:sz w:val="34"/>
+          <w:szCs w:val="34"/>
         </w:rPr>
         <w:t>4</w:t>
       </w:r>
@@ -170,44 +202,44 @@
         </w:numPr>
         <w:jc w:val="both"/>
         <w:rPr>
-          <w:rFonts w:ascii="Calibri" w:hAnsi="Calibri" w:cs="Calibri"/>
-          <w:sz w:val="32"/>
-          <w:szCs w:val="32"/>
-        </w:rPr>
-      </w:pPr>
-      <w:r>
-        <w:rPr>
-          <w:rFonts w:ascii="Calibri" w:hAnsi="Calibri" w:cs="Calibri"/>
-          <w:b/>
-          <w:bCs/>
-          <w:sz w:val="32"/>
-          <w:szCs w:val="32"/>
+          <w:rFonts w:ascii="Carlito" w:hAnsi="Carlito" w:cs="Carlito"/>
+          <w:sz w:val="34"/>
+          <w:szCs w:val="34"/>
+        </w:rPr>
+      </w:pPr>
+      <w:r>
+        <w:rPr>
+          <w:rFonts w:ascii="Carlito" w:hAnsi="Carlito" w:cs="Carlito"/>
+          <w:b/>
+          <w:bCs/>
+          <w:sz w:val="34"/>
+          <w:szCs w:val="34"/>
         </w:rPr>
         <w:t>reduce()</w:t>
       </w:r>
       <w:r>
         <w:rPr>
-          <w:rFonts w:ascii="Calibri" w:hAnsi="Calibri" w:cs="Calibri"/>
-          <w:sz w:val="32"/>
-          <w:szCs w:val="32"/>
+          <w:rFonts w:ascii="Carlito" w:hAnsi="Carlito" w:cs="Carlito"/>
+          <w:sz w:val="34"/>
+          <w:szCs w:val="34"/>
         </w:rPr>
         <w:t xml:space="preserve"> Function………………………………………………………</w:t>
       </w:r>
       <w:r>
         <w:rPr>
-          <w:rFonts w:ascii="Calibri" w:hAnsi="Calibri" w:cs="Calibri"/>
-          <w:sz w:val="32"/>
-          <w:szCs w:val="32"/>
-        </w:rPr>
-        <w:t>……………</w:t>
-      </w:r>
-      <w:r>
-        <w:rPr>
-          <w:rFonts w:ascii="Calibri" w:hAnsi="Calibri" w:cs="Calibri"/>
-          <w:sz w:val="32"/>
-          <w:szCs w:val="32"/>
-        </w:rPr>
-        <w:t>…..5</w:t>
+          <w:rFonts w:ascii="Carlito" w:hAnsi="Carlito" w:cs="Carlito"/>
+          <w:sz w:val="34"/>
+          <w:szCs w:val="34"/>
+        </w:rPr>
+        <w:t>…………</w:t>
+      </w:r>
+      <w:r>
+        <w:rPr>
+          <w:rFonts w:ascii="Carlito" w:hAnsi="Carlito" w:cs="Carlito"/>
+          <w:sz w:val="34"/>
+          <w:szCs w:val="34"/>
+        </w:rPr>
+        <w:t>..5</w:t>
       </w:r>
     </w:p>
     <w:p>
@@ -219,42 +251,50 @@
         </w:numPr>
         <w:jc w:val="both"/>
         <w:rPr>
-          <w:rFonts w:ascii="Calibri" w:hAnsi="Calibri" w:cs="Calibri"/>
-          <w:sz w:val="32"/>
-          <w:szCs w:val="32"/>
-        </w:rPr>
-      </w:pPr>
-      <w:r>
-        <w:rPr>
-          <w:rFonts w:ascii="Calibri" w:hAnsi="Calibri" w:cs="Calibri"/>
-          <w:b/>
-          <w:bCs/>
-          <w:sz w:val="32"/>
-          <w:szCs w:val="32"/>
+          <w:rFonts w:ascii="Carlito" w:hAnsi="Carlito" w:cs="Carlito"/>
+          <w:sz w:val="34"/>
+          <w:szCs w:val="34"/>
+        </w:rPr>
+      </w:pPr>
+      <w:r>
+        <w:rPr>
+          <w:rFonts w:ascii="Carlito" w:hAnsi="Carlito" w:cs="Carlito"/>
+          <w:b/>
+          <w:bCs/>
+          <w:sz w:val="34"/>
+          <w:szCs w:val="34"/>
         </w:rPr>
         <w:t>divmod()</w:t>
       </w:r>
       <w:r>
         <w:rPr>
-          <w:rFonts w:ascii="Calibri" w:hAnsi="Calibri" w:cs="Calibri"/>
-          <w:sz w:val="32"/>
-          <w:szCs w:val="32"/>
+          <w:rFonts w:ascii="Carlito" w:hAnsi="Carlito" w:cs="Carlito"/>
+          <w:sz w:val="34"/>
+          <w:szCs w:val="34"/>
         </w:rPr>
         <w:t xml:space="preserve"> Function…………………………………………………………</w:t>
       </w:r>
       <w:r>
         <w:rPr>
-          <w:rFonts w:ascii="Calibri" w:hAnsi="Calibri" w:cs="Calibri"/>
-          <w:sz w:val="32"/>
-          <w:szCs w:val="32"/>
-        </w:rPr>
-        <w:t>……………</w:t>
-      </w:r>
-      <w:r>
-        <w:rPr>
-          <w:rFonts w:ascii="Calibri" w:hAnsi="Calibri" w:cs="Calibri"/>
-          <w:sz w:val="32"/>
-          <w:szCs w:val="32"/>
+          <w:rFonts w:ascii="Carlito" w:hAnsi="Carlito" w:cs="Carlito"/>
+          <w:sz w:val="34"/>
+          <w:szCs w:val="34"/>
+        </w:rPr>
+        <w:t>……</w:t>
+      </w:r>
+      <w:r>
+        <w:rPr>
+          <w:rFonts w:ascii="Carlito" w:hAnsi="Carlito" w:cs="Carlito"/>
+          <w:sz w:val="34"/>
+          <w:szCs w:val="34"/>
+        </w:rPr>
+        <w:t>..</w:t>
+      </w:r>
+      <w:r>
+        <w:rPr>
+          <w:rFonts w:ascii="Carlito" w:hAnsi="Carlito" w:cs="Carlito"/>
+          <w:sz w:val="34"/>
+          <w:szCs w:val="34"/>
         </w:rPr>
         <w:t>.6</w:t>
       </w:r>
@@ -263,35 +303,35 @@
       <w:pPr>
         <w:jc w:val="both"/>
         <w:rPr>
-          <w:rFonts w:ascii="Calibri" w:hAnsi="Calibri" w:cs="Calibri"/>
-          <w:sz w:val="32"/>
-          <w:szCs w:val="32"/>
-        </w:rPr>
-      </w:pPr>
-    </w:p>
-    <w:p>
-      <w:pPr>
-        <w:jc w:val="both"/>
-        <w:rPr>
-          <w:rFonts w:ascii="Calibri" w:hAnsi="Calibri" w:cs="Calibri"/>
-          <w:sz w:val="32"/>
-          <w:szCs w:val="32"/>
-        </w:rPr>
-      </w:pPr>
-    </w:p>
-    <w:p>
-      <w:pPr>
-        <w:rPr>
-          <w:rFonts w:ascii="Calibri" w:hAnsi="Calibri" w:cs="Calibri"/>
-          <w:sz w:val="32"/>
-          <w:szCs w:val="32"/>
-        </w:rPr>
-      </w:pPr>
-      <w:r>
-        <w:rPr>
-          <w:rFonts w:ascii="Calibri" w:hAnsi="Calibri" w:cs="Calibri"/>
-          <w:sz w:val="32"/>
-          <w:szCs w:val="32"/>
+          <w:rFonts w:ascii="Carlito" w:hAnsi="Carlito" w:cs="Carlito"/>
+          <w:sz w:val="34"/>
+          <w:szCs w:val="34"/>
+        </w:rPr>
+      </w:pPr>
+    </w:p>
+    <w:p>
+      <w:pPr>
+        <w:jc w:val="both"/>
+        <w:rPr>
+          <w:rFonts w:ascii="Carlito" w:hAnsi="Carlito" w:cs="Carlito"/>
+          <w:sz w:val="34"/>
+          <w:szCs w:val="34"/>
+        </w:rPr>
+      </w:pPr>
+    </w:p>
+    <w:p>
+      <w:pPr>
+        <w:rPr>
+          <w:rFonts w:ascii="Carlito" w:hAnsi="Carlito" w:cs="Carlito"/>
+          <w:sz w:val="34"/>
+          <w:szCs w:val="34"/>
+        </w:rPr>
+      </w:pPr>
+      <w:r>
+        <w:rPr>
+          <w:rFonts w:ascii="Carlito" w:hAnsi="Carlito" w:cs="Carlito"/>
+          <w:sz w:val="34"/>
+          <w:szCs w:val="34"/>
         </w:rPr>
         <w:br w:type="page"/>
       </w:r>
@@ -301,16 +341,16 @@
         <w:spacing w:line="240" w:lineRule="auto"/>
         <w:jc w:val="both"/>
         <w:rPr>
-          <w:rFonts w:ascii="Calibri" w:hAnsi="Calibri" w:cs="Calibri"/>
-          <w:b/>
-          <w:bCs/>
-          <w:sz w:val="34"/>
-          <w:szCs w:val="34"/>
-        </w:rPr>
-      </w:pPr>
-      <w:r>
-        <w:rPr>
-          <w:rFonts w:ascii="Calibri" w:hAnsi="Calibri" w:cs="Calibri"/>
+          <w:rFonts w:ascii="Carlito" w:hAnsi="Carlito" w:cs="Carlito"/>
+          <w:b/>
+          <w:bCs/>
+          <w:sz w:val="34"/>
+          <w:szCs w:val="34"/>
+        </w:rPr>
+      </w:pPr>
+      <w:r>
+        <w:rPr>
+          <w:rFonts w:ascii="Carlito" w:hAnsi="Carlito" w:cs="Carlito"/>
           <w:b/>
           <w:bCs/>
           <w:sz w:val="34"/>
@@ -325,14 +365,14 @@
         <w:spacing w:line="240" w:lineRule="auto"/>
         <w:jc w:val="both"/>
         <w:rPr>
-          <w:rFonts w:ascii="Calibri" w:hAnsi="Calibri" w:cs="Calibri"/>
-          <w:sz w:val="34"/>
-          <w:szCs w:val="34"/>
-        </w:rPr>
-      </w:pPr>
-      <w:r>
-        <w:rPr>
-          <w:rFonts w:ascii="Calibri" w:hAnsi="Calibri" w:cs="Calibri"/>
+          <w:rFonts w:ascii="Carlito" w:hAnsi="Carlito" w:cs="Carlito"/>
+          <w:sz w:val="34"/>
+          <w:szCs w:val="34"/>
+        </w:rPr>
+      </w:pPr>
+      <w:r>
+        <w:rPr>
+          <w:rFonts w:ascii="Carlito" w:hAnsi="Carlito" w:cs="Carlito"/>
           <w:sz w:val="34"/>
           <w:szCs w:val="34"/>
         </w:rPr>
@@ -344,14 +384,14 @@
         <w:spacing w:line="240" w:lineRule="auto"/>
         <w:jc w:val="both"/>
         <w:rPr>
-          <w:rFonts w:ascii="Calibri" w:hAnsi="Calibri" w:cs="Calibri"/>
-          <w:sz w:val="34"/>
-          <w:szCs w:val="34"/>
-        </w:rPr>
-      </w:pPr>
-      <w:r>
-        <w:rPr>
-          <w:rFonts w:ascii="Calibri" w:hAnsi="Calibri" w:cs="Calibri"/>
+          <w:rFonts w:ascii="Carlito" w:hAnsi="Carlito" w:cs="Carlito"/>
+          <w:sz w:val="34"/>
+          <w:szCs w:val="34"/>
+        </w:rPr>
+      </w:pPr>
+      <w:r>
+        <w:rPr>
+          <w:rFonts w:ascii="Carlito" w:hAnsi="Carlito" w:cs="Carlito"/>
           <w:sz w:val="34"/>
           <w:szCs w:val="34"/>
         </w:rPr>
@@ -359,7 +399,7 @@
       </w:r>
       <w:r>
         <w:rPr>
-          <w:rFonts w:ascii="Calibri" w:hAnsi="Calibri" w:cs="Calibri"/>
+          <w:rFonts w:ascii="Carlito" w:hAnsi="Carlito" w:cs="Carlito"/>
           <w:b/>
           <w:bCs/>
           <w:sz w:val="34"/>
@@ -369,7 +409,7 @@
       </w:r>
       <w:r>
         <w:rPr>
-          <w:rFonts w:ascii="Calibri" w:hAnsi="Calibri" w:cs="Calibri"/>
+          <w:rFonts w:ascii="Carlito" w:hAnsi="Carlito" w:cs="Carlito"/>
           <w:sz w:val="34"/>
           <w:szCs w:val="34"/>
         </w:rPr>
@@ -381,17 +421,17 @@
         <w:spacing w:line="240" w:lineRule="auto"/>
         <w:jc w:val="both"/>
         <w:rPr>
-          <w:rFonts w:ascii="Calibri" w:hAnsi="Calibri" w:cs="Calibri"/>
-          <w:b/>
-          <w:bCs/>
-          <w:color w:val="D86DCB" w:themeColor="accent5" w:themeTint="99"/>
-          <w:sz w:val="34"/>
-          <w:szCs w:val="34"/>
-        </w:rPr>
-      </w:pPr>
-      <w:r>
-        <w:rPr>
-          <w:rFonts w:ascii="Calibri" w:hAnsi="Calibri" w:cs="Calibri"/>
+          <w:rFonts w:ascii="Carlito" w:hAnsi="Carlito" w:cs="Carlito"/>
+          <w:b/>
+          <w:bCs/>
+          <w:color w:val="D86DCB" w:themeColor="accent5" w:themeTint="99"/>
+          <w:sz w:val="34"/>
+          <w:szCs w:val="34"/>
+        </w:rPr>
+      </w:pPr>
+      <w:r>
+        <w:rPr>
+          <w:rFonts w:ascii="Carlito" w:hAnsi="Carlito" w:cs="Carlito"/>
           <w:b/>
           <w:bCs/>
           <w:color w:val="D86DCB" w:themeColor="accent5" w:themeTint="99"/>
@@ -406,17 +446,17 @@
         <w:spacing w:line="240" w:lineRule="auto"/>
         <w:jc w:val="both"/>
         <w:rPr>
-          <w:rFonts w:ascii="Calibri" w:hAnsi="Calibri" w:cs="Calibri"/>
-          <w:b/>
-          <w:bCs/>
-          <w:color w:val="D86DCB" w:themeColor="accent5" w:themeTint="99"/>
-          <w:sz w:val="34"/>
-          <w:szCs w:val="34"/>
-        </w:rPr>
-      </w:pPr>
-      <w:r>
-        <w:rPr>
-          <w:rFonts w:ascii="Calibri" w:hAnsi="Calibri" w:cs="Calibri"/>
+          <w:rFonts w:ascii="Carlito" w:hAnsi="Carlito" w:cs="Carlito"/>
+          <w:b/>
+          <w:bCs/>
+          <w:color w:val="D86DCB" w:themeColor="accent5" w:themeTint="99"/>
+          <w:sz w:val="34"/>
+          <w:szCs w:val="34"/>
+        </w:rPr>
+      </w:pPr>
+      <w:r>
+        <w:rPr>
+          <w:rFonts w:ascii="Carlito" w:hAnsi="Carlito" w:cs="Carlito"/>
           <w:b/>
           <w:bCs/>
           <w:color w:val="D86DCB" w:themeColor="accent5" w:themeTint="99"/>
@@ -431,14 +471,14 @@
         <w:spacing w:line="240" w:lineRule="auto"/>
         <w:jc w:val="both"/>
         <w:rPr>
-          <w:rFonts w:ascii="Calibri" w:hAnsi="Calibri" w:cs="Calibri"/>
-          <w:sz w:val="34"/>
-          <w:szCs w:val="34"/>
-        </w:rPr>
-      </w:pPr>
-      <w:r>
-        <w:rPr>
-          <w:rFonts w:ascii="Calibri" w:hAnsi="Calibri" w:cs="Calibri"/>
+          <w:rFonts w:ascii="Carlito" w:hAnsi="Carlito" w:cs="Carlito"/>
+          <w:sz w:val="34"/>
+          <w:szCs w:val="34"/>
+        </w:rPr>
+      </w:pPr>
+      <w:r>
+        <w:rPr>
+          <w:rFonts w:ascii="Carlito" w:hAnsi="Carlito" w:cs="Carlito"/>
           <w:sz w:val="34"/>
           <w:szCs w:val="34"/>
         </w:rPr>
@@ -446,7 +486,7 @@
       </w:r>
       <w:r>
         <w:rPr>
-          <w:rFonts w:ascii="Calibri" w:hAnsi="Calibri" w:cs="Calibri"/>
+          <w:rFonts w:ascii="Carlito" w:hAnsi="Carlito" w:cs="Carlito"/>
           <w:b/>
           <w:bCs/>
           <w:sz w:val="34"/>
@@ -456,7 +496,7 @@
       </w:r>
       <w:r>
         <w:rPr>
-          <w:rFonts w:ascii="Calibri" w:hAnsi="Calibri" w:cs="Calibri"/>
+          <w:rFonts w:ascii="Carlito" w:hAnsi="Carlito" w:cs="Carlito"/>
           <w:sz w:val="34"/>
           <w:szCs w:val="34"/>
         </w:rPr>
@@ -468,17 +508,17 @@
         <w:spacing w:line="240" w:lineRule="auto"/>
         <w:jc w:val="both"/>
         <w:rPr>
-          <w:rFonts w:ascii="Calibri" w:hAnsi="Calibri" w:cs="Calibri"/>
-          <w:b/>
-          <w:bCs/>
-          <w:color w:val="D86DCB" w:themeColor="accent5" w:themeTint="99"/>
-          <w:sz w:val="34"/>
-          <w:szCs w:val="34"/>
-        </w:rPr>
-      </w:pPr>
-      <w:r>
-        <w:rPr>
-          <w:rFonts w:ascii="Calibri" w:hAnsi="Calibri" w:cs="Calibri"/>
+          <w:rFonts w:ascii="Carlito" w:hAnsi="Carlito" w:cs="Carlito"/>
+          <w:b/>
+          <w:bCs/>
+          <w:color w:val="D86DCB" w:themeColor="accent5" w:themeTint="99"/>
+          <w:sz w:val="34"/>
+          <w:szCs w:val="34"/>
+        </w:rPr>
+      </w:pPr>
+      <w:r>
+        <w:rPr>
+          <w:rFonts w:ascii="Carlito" w:hAnsi="Carlito" w:cs="Carlito"/>
           <w:b/>
           <w:bCs/>
           <w:color w:val="D86DCB" w:themeColor="accent5" w:themeTint="99"/>
@@ -493,17 +533,17 @@
         <w:spacing w:line="240" w:lineRule="auto"/>
         <w:jc w:val="both"/>
         <w:rPr>
-          <w:rFonts w:ascii="Calibri" w:hAnsi="Calibri" w:cs="Calibri"/>
-          <w:b/>
-          <w:bCs/>
-          <w:color w:val="D86DCB" w:themeColor="accent5" w:themeTint="99"/>
-          <w:sz w:val="34"/>
-          <w:szCs w:val="34"/>
-        </w:rPr>
-      </w:pPr>
-      <w:r>
-        <w:rPr>
-          <w:rFonts w:ascii="Calibri" w:hAnsi="Calibri" w:cs="Calibri"/>
+          <w:rFonts w:ascii="Carlito" w:hAnsi="Carlito" w:cs="Carlito"/>
+          <w:b/>
+          <w:bCs/>
+          <w:color w:val="D86DCB" w:themeColor="accent5" w:themeTint="99"/>
+          <w:sz w:val="34"/>
+          <w:szCs w:val="34"/>
+        </w:rPr>
+      </w:pPr>
+      <w:r>
+        <w:rPr>
+          <w:rFonts w:ascii="Carlito" w:hAnsi="Carlito" w:cs="Carlito"/>
           <w:b/>
           <w:bCs/>
           <w:color w:val="D86DCB" w:themeColor="accent5" w:themeTint="99"/>
@@ -518,7 +558,7 @@
         <w:spacing w:line="240" w:lineRule="auto"/>
         <w:jc w:val="both"/>
         <w:rPr>
-          <w:rFonts w:ascii="Calibri" w:hAnsi="Calibri" w:cs="Calibri"/>
+          <w:rFonts w:ascii="Carlito" w:hAnsi="Carlito" w:cs="Carlito"/>
           <w:sz w:val="34"/>
           <w:szCs w:val="34"/>
         </w:rPr>
@@ -529,14 +569,14 @@
         <w:spacing w:line="240" w:lineRule="auto"/>
         <w:jc w:val="center"/>
         <w:rPr>
-          <w:rFonts w:ascii="Calibri" w:hAnsi="Calibri" w:cs="Calibri"/>
-          <w:sz w:val="34"/>
-          <w:szCs w:val="34"/>
-        </w:rPr>
-      </w:pPr>
-      <w:r>
-        <w:rPr>
-          <w:rFonts w:ascii="Calibri" w:hAnsi="Calibri" w:cs="Calibri"/>
+          <w:rFonts w:ascii="Carlito" w:hAnsi="Carlito" w:cs="Carlito"/>
+          <w:sz w:val="34"/>
+          <w:szCs w:val="34"/>
+        </w:rPr>
+      </w:pPr>
+      <w:r>
+        <w:rPr>
+          <w:rFonts w:ascii="Carlito" w:hAnsi="Carlito" w:cs="Carlito"/>
           <w:sz w:val="34"/>
           <w:szCs w:val="34"/>
         </w:rPr>
@@ -548,27 +588,27 @@
         <w:spacing w:line="240" w:lineRule="auto"/>
         <w:jc w:val="both"/>
         <w:rPr>
-          <w:rFonts w:ascii="Calibri" w:hAnsi="Calibri" w:cs="Calibri"/>
-          <w:sz w:val="34"/>
-          <w:szCs w:val="34"/>
-        </w:rPr>
-      </w:pPr>
-    </w:p>
-    <w:p>
-      <w:pPr>
-        <w:spacing w:line="240" w:lineRule="auto"/>
-        <w:jc w:val="both"/>
-        <w:rPr>
-          <w:rFonts w:ascii="Calibri" w:hAnsi="Calibri" w:cs="Calibri"/>
-          <w:b/>
-          <w:bCs/>
-          <w:sz w:val="34"/>
-          <w:szCs w:val="34"/>
-        </w:rPr>
-      </w:pPr>
-      <w:r>
-        <w:rPr>
-          <w:rFonts w:ascii="Calibri" w:hAnsi="Calibri" w:cs="Calibri"/>
+          <w:rFonts w:ascii="Carlito" w:hAnsi="Carlito" w:cs="Carlito"/>
+          <w:sz w:val="34"/>
+          <w:szCs w:val="34"/>
+        </w:rPr>
+      </w:pPr>
+    </w:p>
+    <w:p>
+      <w:pPr>
+        <w:spacing w:line="240" w:lineRule="auto"/>
+        <w:jc w:val="both"/>
+        <w:rPr>
+          <w:rFonts w:ascii="Carlito" w:hAnsi="Carlito" w:cs="Carlito"/>
+          <w:b/>
+          <w:bCs/>
+          <w:sz w:val="34"/>
+          <w:szCs w:val="34"/>
+        </w:rPr>
+      </w:pPr>
+      <w:r>
+        <w:rPr>
+          <w:rFonts w:ascii="Carlito" w:hAnsi="Carlito" w:cs="Carlito"/>
           <w:b/>
           <w:bCs/>
           <w:sz w:val="34"/>
@@ -578,7 +618,7 @@
       </w:r>
       <w:r>
         <w:rPr>
-          <w:rFonts w:ascii="Calibri" w:hAnsi="Calibri" w:cs="Calibri"/>
+          <w:rFonts w:ascii="Carlito" w:hAnsi="Carlito" w:cs="Carlito"/>
           <w:b/>
           <w:bCs/>
           <w:sz w:val="34"/>
@@ -588,7 +628,7 @@
       </w:r>
       <w:r>
         <w:rPr>
-          <w:rFonts w:ascii="Calibri" w:hAnsi="Calibri" w:cs="Calibri"/>
+          <w:rFonts w:ascii="Carlito" w:hAnsi="Carlito" w:cs="Carlito"/>
           <w:b/>
           <w:bCs/>
           <w:sz w:val="34"/>
@@ -602,14 +642,14 @@
         <w:spacing w:line="240" w:lineRule="auto"/>
         <w:jc w:val="both"/>
         <w:rPr>
-          <w:rFonts w:ascii="Calibri" w:hAnsi="Calibri" w:cs="Calibri"/>
-          <w:sz w:val="34"/>
-          <w:szCs w:val="34"/>
-        </w:rPr>
-      </w:pPr>
-      <w:r>
-        <w:rPr>
-          <w:rFonts w:ascii="Calibri" w:hAnsi="Calibri" w:cs="Calibri"/>
+          <w:rFonts w:ascii="Carlito" w:hAnsi="Carlito" w:cs="Carlito"/>
+          <w:sz w:val="34"/>
+          <w:szCs w:val="34"/>
+        </w:rPr>
+      </w:pPr>
+      <w:r>
+        <w:rPr>
+          <w:rFonts w:ascii="Carlito" w:hAnsi="Carlito" w:cs="Carlito"/>
           <w:sz w:val="34"/>
           <w:szCs w:val="34"/>
         </w:rPr>
@@ -617,7 +657,7 @@
       </w:r>
       <w:r>
         <w:rPr>
-          <w:rFonts w:ascii="Calibri" w:hAnsi="Calibri" w:cs="Calibri"/>
+          <w:rFonts w:ascii="Carlito" w:hAnsi="Carlito" w:cs="Carlito"/>
           <w:b/>
           <w:bCs/>
           <w:sz w:val="34"/>
@@ -627,7 +667,7 @@
       </w:r>
       <w:r>
         <w:rPr>
-          <w:rFonts w:ascii="Calibri" w:hAnsi="Calibri" w:cs="Calibri"/>
+          <w:rFonts w:ascii="Carlito" w:hAnsi="Carlito" w:cs="Carlito"/>
           <w:sz w:val="34"/>
           <w:szCs w:val="34"/>
         </w:rPr>
@@ -639,14 +679,14 @@
         <w:spacing w:line="240" w:lineRule="auto"/>
         <w:jc w:val="both"/>
         <w:rPr>
-          <w:rFonts w:ascii="Calibri" w:hAnsi="Calibri" w:cs="Calibri"/>
-          <w:sz w:val="34"/>
-          <w:szCs w:val="34"/>
-        </w:rPr>
-      </w:pPr>
-      <w:r>
-        <w:rPr>
-          <w:rFonts w:ascii="Calibri" w:hAnsi="Calibri" w:cs="Calibri"/>
+          <w:rFonts w:ascii="Carlito" w:hAnsi="Carlito" w:cs="Carlito"/>
+          <w:sz w:val="34"/>
+          <w:szCs w:val="34"/>
+        </w:rPr>
+      </w:pPr>
+      <w:r>
+        <w:rPr>
+          <w:rFonts w:ascii="Carlito" w:hAnsi="Carlito" w:cs="Carlito"/>
           <w:sz w:val="34"/>
           <w:szCs w:val="34"/>
         </w:rPr>
@@ -663,14 +703,14 @@
         <w:spacing w:line="240" w:lineRule="auto"/>
         <w:jc w:val="both"/>
         <w:rPr>
-          <w:rFonts w:ascii="Calibri" w:hAnsi="Calibri" w:cs="Calibri"/>
-          <w:sz w:val="34"/>
-          <w:szCs w:val="34"/>
-        </w:rPr>
-      </w:pPr>
-      <w:r>
-        <w:rPr>
-          <w:rFonts w:ascii="Calibri" w:hAnsi="Calibri" w:cs="Calibri"/>
+          <w:rFonts w:ascii="Carlito" w:hAnsi="Carlito" w:cs="Carlito"/>
+          <w:sz w:val="34"/>
+          <w:szCs w:val="34"/>
+        </w:rPr>
+      </w:pPr>
+      <w:r>
+        <w:rPr>
+          <w:rFonts w:ascii="Carlito" w:hAnsi="Carlito" w:cs="Carlito"/>
           <w:sz w:val="34"/>
           <w:szCs w:val="34"/>
         </w:rPr>
@@ -678,7 +718,7 @@
       </w:r>
       <w:r>
         <w:rPr>
-          <w:rFonts w:ascii="Calibri" w:hAnsi="Calibri" w:cs="Calibri"/>
+          <w:rFonts w:ascii="Carlito" w:hAnsi="Carlito" w:cs="Carlito"/>
           <w:sz w:val="26"/>
           <w:szCs w:val="26"/>
         </w:rPr>
@@ -686,7 +726,7 @@
       </w:r>
       <w:r>
         <w:rPr>
-          <w:rFonts w:ascii="Calibri" w:hAnsi="Calibri" w:cs="Calibri"/>
+          <w:rFonts w:ascii="Carlito" w:hAnsi="Carlito" w:cs="Carlito"/>
           <w:sz w:val="34"/>
           <w:szCs w:val="34"/>
         </w:rPr>
@@ -703,14 +743,14 @@
         <w:spacing w:line="240" w:lineRule="auto"/>
         <w:jc w:val="both"/>
         <w:rPr>
-          <w:rFonts w:ascii="Calibri" w:hAnsi="Calibri" w:cs="Calibri"/>
-          <w:sz w:val="34"/>
-          <w:szCs w:val="34"/>
-        </w:rPr>
-      </w:pPr>
-      <w:r>
-        <w:rPr>
-          <w:rFonts w:ascii="Calibri" w:hAnsi="Calibri" w:cs="Calibri"/>
+          <w:rFonts w:ascii="Carlito" w:hAnsi="Carlito" w:cs="Carlito"/>
+          <w:sz w:val="34"/>
+          <w:szCs w:val="34"/>
+        </w:rPr>
+      </w:pPr>
+      <w:r>
+        <w:rPr>
+          <w:rFonts w:ascii="Carlito" w:hAnsi="Carlito" w:cs="Carlito"/>
           <w:sz w:val="34"/>
           <w:szCs w:val="34"/>
         </w:rPr>
@@ -718,7 +758,7 @@
       </w:r>
       <w:r>
         <w:rPr>
-          <w:rFonts w:ascii="Calibri" w:hAnsi="Calibri" w:cs="Calibri"/>
+          <w:rFonts w:ascii="Carlito" w:hAnsi="Carlito" w:cs="Carlito"/>
           <w:sz w:val="26"/>
           <w:szCs w:val="26"/>
         </w:rPr>
@@ -726,7 +766,7 @@
       </w:r>
       <w:r>
         <w:rPr>
-          <w:rFonts w:ascii="Calibri" w:hAnsi="Calibri" w:cs="Calibri"/>
+          <w:rFonts w:ascii="Carlito" w:hAnsi="Carlito" w:cs="Carlito"/>
           <w:sz w:val="34"/>
           <w:szCs w:val="34"/>
         </w:rPr>
@@ -738,17 +778,17 @@
         <w:spacing w:line="240" w:lineRule="auto"/>
         <w:jc w:val="both"/>
         <w:rPr>
-          <w:rFonts w:ascii="Calibri" w:hAnsi="Calibri" w:cs="Calibri"/>
-          <w:b/>
-          <w:bCs/>
-          <w:color w:val="D86DCB" w:themeColor="accent5" w:themeTint="99"/>
-          <w:sz w:val="34"/>
-          <w:szCs w:val="34"/>
-        </w:rPr>
-      </w:pPr>
-      <w:r>
-        <w:rPr>
-          <w:rFonts w:ascii="Calibri" w:hAnsi="Calibri" w:cs="Calibri"/>
+          <w:rFonts w:ascii="Carlito" w:hAnsi="Carlito" w:cs="Carlito"/>
+          <w:b/>
+          <w:bCs/>
+          <w:color w:val="D86DCB" w:themeColor="accent5" w:themeTint="99"/>
+          <w:sz w:val="34"/>
+          <w:szCs w:val="34"/>
+        </w:rPr>
+      </w:pPr>
+      <w:r>
+        <w:rPr>
+          <w:rFonts w:ascii="Carlito" w:hAnsi="Carlito" w:cs="Carlito"/>
           <w:b/>
           <w:bCs/>
           <w:color w:val="D86DCB" w:themeColor="accent5" w:themeTint="99"/>
@@ -763,14 +803,14 @@
         <w:spacing w:line="240" w:lineRule="auto"/>
         <w:jc w:val="both"/>
         <w:rPr>
-          <w:rFonts w:ascii="Calibri" w:hAnsi="Calibri" w:cs="Calibri"/>
-          <w:sz w:val="34"/>
-          <w:szCs w:val="34"/>
-        </w:rPr>
-      </w:pPr>
-      <w:r>
-        <w:rPr>
-          <w:rFonts w:ascii="Calibri" w:hAnsi="Calibri" w:cs="Calibri"/>
+          <w:rFonts w:ascii="Carlito" w:hAnsi="Carlito" w:cs="Carlito"/>
+          <w:sz w:val="34"/>
+          <w:szCs w:val="34"/>
+        </w:rPr>
+      </w:pPr>
+      <w:r>
+        <w:rPr>
+          <w:rFonts w:ascii="Carlito" w:hAnsi="Carlito" w:cs="Carlito"/>
           <w:sz w:val="34"/>
           <w:szCs w:val="34"/>
         </w:rPr>
@@ -778,7 +818,7 @@
       </w:r>
       <w:r>
         <w:rPr>
-          <w:rFonts w:ascii="Calibri" w:hAnsi="Calibri" w:cs="Calibri"/>
+          <w:rFonts w:ascii="Carlito" w:hAnsi="Carlito" w:cs="Carlito"/>
           <w:b/>
           <w:bCs/>
           <w:sz w:val="34"/>
@@ -788,7 +828,7 @@
       </w:r>
       <w:r>
         <w:rPr>
-          <w:rFonts w:ascii="Calibri" w:hAnsi="Calibri" w:cs="Calibri"/>
+          <w:rFonts w:ascii="Carlito" w:hAnsi="Carlito" w:cs="Carlito"/>
           <w:sz w:val="34"/>
           <w:szCs w:val="34"/>
         </w:rPr>
@@ -800,14 +840,14 @@
         <w:spacing w:line="240" w:lineRule="auto"/>
         <w:jc w:val="both"/>
         <w:rPr>
-          <w:rFonts w:ascii="Calibri" w:hAnsi="Calibri" w:cs="Calibri"/>
-          <w:sz w:val="34"/>
-          <w:szCs w:val="34"/>
-        </w:rPr>
-      </w:pPr>
-      <w:r>
-        <w:rPr>
-          <w:rFonts w:ascii="Calibri" w:hAnsi="Calibri" w:cs="Calibri"/>
+          <w:rFonts w:ascii="Carlito" w:hAnsi="Carlito" w:cs="Carlito"/>
+          <w:sz w:val="34"/>
+          <w:szCs w:val="34"/>
+        </w:rPr>
+      </w:pPr>
+      <w:r>
+        <w:rPr>
+          <w:rFonts w:ascii="Carlito" w:hAnsi="Carlito" w:cs="Carlito"/>
           <w:sz w:val="34"/>
           <w:szCs w:val="34"/>
         </w:rPr>
@@ -815,7 +855,7 @@
       </w:r>
       <w:r>
         <w:rPr>
-          <w:rFonts w:ascii="Calibri" w:hAnsi="Calibri" w:cs="Calibri"/>
+          <w:rFonts w:ascii="Carlito" w:hAnsi="Carlito" w:cs="Carlito"/>
           <w:b/>
           <w:bCs/>
           <w:sz w:val="34"/>
@@ -825,7 +865,7 @@
       </w:r>
       <w:r>
         <w:rPr>
-          <w:rFonts w:ascii="Calibri" w:hAnsi="Calibri" w:cs="Calibri"/>
+          <w:rFonts w:ascii="Carlito" w:hAnsi="Carlito" w:cs="Carlito"/>
           <w:sz w:val="34"/>
           <w:szCs w:val="34"/>
         </w:rPr>
@@ -833,7 +873,7 @@
       </w:r>
       <w:r>
         <w:rPr>
-          <w:rFonts w:ascii="Calibri" w:hAnsi="Calibri" w:cs="Calibri"/>
+          <w:rFonts w:ascii="Carlito" w:hAnsi="Carlito" w:cs="Carlito"/>
           <w:b/>
           <w:bCs/>
           <w:sz w:val="34"/>
@@ -843,7 +883,7 @@
       </w:r>
       <w:r>
         <w:rPr>
-          <w:rFonts w:ascii="Calibri" w:hAnsi="Calibri" w:cs="Calibri"/>
+          <w:rFonts w:ascii="Carlito" w:hAnsi="Carlito" w:cs="Carlito"/>
           <w:sz w:val="34"/>
           <w:szCs w:val="34"/>
         </w:rPr>
@@ -855,17 +895,17 @@
         <w:spacing w:line="240" w:lineRule="auto"/>
         <w:jc w:val="both"/>
         <w:rPr>
-          <w:rFonts w:ascii="Calibri" w:hAnsi="Calibri" w:cs="Calibri"/>
-          <w:b/>
-          <w:bCs/>
-          <w:color w:val="D86DCB" w:themeColor="accent5" w:themeTint="99"/>
-          <w:sz w:val="34"/>
-          <w:szCs w:val="34"/>
-        </w:rPr>
-      </w:pPr>
-      <w:r>
-        <w:rPr>
-          <w:rFonts w:ascii="Calibri" w:hAnsi="Calibri" w:cs="Calibri"/>
+          <w:rFonts w:ascii="Carlito" w:hAnsi="Carlito" w:cs="Carlito"/>
+          <w:b/>
+          <w:bCs/>
+          <w:color w:val="D86DCB" w:themeColor="accent5" w:themeTint="99"/>
+          <w:sz w:val="34"/>
+          <w:szCs w:val="34"/>
+        </w:rPr>
+      </w:pPr>
+      <w:r>
+        <w:rPr>
+          <w:rFonts w:ascii="Carlito" w:hAnsi="Carlito" w:cs="Carlito"/>
           <w:b/>
           <w:bCs/>
           <w:color w:val="D86DCB" w:themeColor="accent5" w:themeTint="99"/>
@@ -881,17 +921,17 @@
         <w:spacing w:line="240" w:lineRule="auto"/>
         <w:jc w:val="both"/>
         <w:rPr>
-          <w:rFonts w:ascii="Calibri" w:hAnsi="Calibri" w:cs="Calibri"/>
-          <w:b/>
-          <w:bCs/>
-          <w:color w:val="D86DCB" w:themeColor="accent5" w:themeTint="99"/>
-          <w:sz w:val="34"/>
-          <w:szCs w:val="34"/>
-        </w:rPr>
-      </w:pPr>
-      <w:r>
-        <w:rPr>
-          <w:rFonts w:ascii="Calibri" w:hAnsi="Calibri" w:cs="Calibri"/>
+          <w:rFonts w:ascii="Carlito" w:hAnsi="Carlito" w:cs="Carlito"/>
+          <w:b/>
+          <w:bCs/>
+          <w:color w:val="D86DCB" w:themeColor="accent5" w:themeTint="99"/>
+          <w:sz w:val="34"/>
+          <w:szCs w:val="34"/>
+        </w:rPr>
+      </w:pPr>
+      <w:r>
+        <w:rPr>
+          <w:rFonts w:ascii="Carlito" w:hAnsi="Carlito" w:cs="Carlito"/>
           <w:b/>
           <w:bCs/>
           <w:color w:val="D86DCB" w:themeColor="accent5" w:themeTint="99"/>
@@ -906,17 +946,17 @@
         <w:spacing w:line="240" w:lineRule="auto"/>
         <w:jc w:val="both"/>
         <w:rPr>
-          <w:rFonts w:ascii="Calibri" w:hAnsi="Calibri" w:cs="Calibri"/>
-          <w:b/>
-          <w:bCs/>
-          <w:color w:val="D86DCB" w:themeColor="accent5" w:themeTint="99"/>
-          <w:sz w:val="34"/>
-          <w:szCs w:val="34"/>
-        </w:rPr>
-      </w:pPr>
-      <w:r>
-        <w:rPr>
-          <w:rFonts w:ascii="Calibri" w:hAnsi="Calibri" w:cs="Calibri"/>
+          <w:rFonts w:ascii="Carlito" w:hAnsi="Carlito" w:cs="Carlito"/>
+          <w:b/>
+          <w:bCs/>
+          <w:color w:val="D86DCB" w:themeColor="accent5" w:themeTint="99"/>
+          <w:sz w:val="34"/>
+          <w:szCs w:val="34"/>
+        </w:rPr>
+      </w:pPr>
+      <w:r>
+        <w:rPr>
+          <w:rFonts w:ascii="Carlito" w:hAnsi="Carlito" w:cs="Carlito"/>
           <w:b/>
           <w:bCs/>
           <w:color w:val="D86DCB" w:themeColor="accent5" w:themeTint="99"/>
@@ -931,17 +971,17 @@
         <w:spacing w:line="240" w:lineRule="auto"/>
         <w:jc w:val="both"/>
         <w:rPr>
-          <w:rFonts w:ascii="Calibri" w:hAnsi="Calibri" w:cs="Calibri"/>
-          <w:b/>
-          <w:bCs/>
-          <w:color w:val="D86DCB" w:themeColor="accent5" w:themeTint="99"/>
-          <w:sz w:val="34"/>
-          <w:szCs w:val="34"/>
-        </w:rPr>
-      </w:pPr>
-      <w:r>
-        <w:rPr>
-          <w:rFonts w:ascii="Calibri" w:hAnsi="Calibri" w:cs="Calibri"/>
+          <w:rFonts w:ascii="Carlito" w:hAnsi="Carlito" w:cs="Carlito"/>
+          <w:b/>
+          <w:bCs/>
+          <w:color w:val="D86DCB" w:themeColor="accent5" w:themeTint="99"/>
+          <w:sz w:val="34"/>
+          <w:szCs w:val="34"/>
+        </w:rPr>
+      </w:pPr>
+      <w:r>
+        <w:rPr>
+          <w:rFonts w:ascii="Carlito" w:hAnsi="Carlito" w:cs="Carlito"/>
           <w:b/>
           <w:bCs/>
           <w:color w:val="D86DCB" w:themeColor="accent5" w:themeTint="99"/>
@@ -956,17 +996,17 @@
         <w:spacing w:line="240" w:lineRule="auto"/>
         <w:jc w:val="both"/>
         <w:rPr>
-          <w:rFonts w:ascii="Calibri" w:hAnsi="Calibri" w:cs="Calibri"/>
-          <w:b/>
-          <w:bCs/>
-          <w:color w:val="D86DCB" w:themeColor="accent5" w:themeTint="99"/>
-          <w:sz w:val="34"/>
-          <w:szCs w:val="34"/>
-        </w:rPr>
-      </w:pPr>
-      <w:r>
-        <w:rPr>
-          <w:rFonts w:ascii="Calibri" w:hAnsi="Calibri" w:cs="Calibri"/>
+          <w:rFonts w:ascii="Carlito" w:hAnsi="Carlito" w:cs="Carlito"/>
+          <w:b/>
+          <w:bCs/>
+          <w:color w:val="D86DCB" w:themeColor="accent5" w:themeTint="99"/>
+          <w:sz w:val="34"/>
+          <w:szCs w:val="34"/>
+        </w:rPr>
+      </w:pPr>
+      <w:r>
+        <w:rPr>
+          <w:rFonts w:ascii="Carlito" w:hAnsi="Carlito" w:cs="Carlito"/>
           <w:b/>
           <w:bCs/>
           <w:color w:val="D86DCB" w:themeColor="accent5" w:themeTint="99"/>
@@ -981,17 +1021,17 @@
         <w:spacing w:line="240" w:lineRule="auto"/>
         <w:jc w:val="both"/>
         <w:rPr>
-          <w:rFonts w:ascii="Calibri" w:hAnsi="Calibri" w:cs="Calibri"/>
-          <w:b/>
-          <w:bCs/>
-          <w:color w:val="D86DCB" w:themeColor="accent5" w:themeTint="99"/>
-          <w:sz w:val="34"/>
-          <w:szCs w:val="34"/>
-        </w:rPr>
-      </w:pPr>
-      <w:r>
-        <w:rPr>
-          <w:rFonts w:ascii="Calibri" w:hAnsi="Calibri" w:cs="Calibri"/>
+          <w:rFonts w:ascii="Carlito" w:hAnsi="Carlito" w:cs="Carlito"/>
+          <w:b/>
+          <w:bCs/>
+          <w:color w:val="D86DCB" w:themeColor="accent5" w:themeTint="99"/>
+          <w:sz w:val="34"/>
+          <w:szCs w:val="34"/>
+        </w:rPr>
+      </w:pPr>
+      <w:r>
+        <w:rPr>
+          <w:rFonts w:ascii="Carlito" w:hAnsi="Carlito" w:cs="Carlito"/>
           <w:b/>
           <w:bCs/>
           <w:color w:val="D86DCB" w:themeColor="accent5" w:themeTint="99"/>
@@ -1006,17 +1046,17 @@
         <w:spacing w:line="240" w:lineRule="auto"/>
         <w:jc w:val="both"/>
         <w:rPr>
-          <w:rFonts w:ascii="Calibri" w:hAnsi="Calibri" w:cs="Calibri"/>
-          <w:b/>
-          <w:bCs/>
-          <w:color w:val="D86DCB" w:themeColor="accent5" w:themeTint="99"/>
-          <w:sz w:val="34"/>
-          <w:szCs w:val="34"/>
-        </w:rPr>
-      </w:pPr>
-      <w:r>
-        <w:rPr>
-          <w:rFonts w:ascii="Calibri" w:hAnsi="Calibri" w:cs="Calibri"/>
+          <w:rFonts w:ascii="Carlito" w:hAnsi="Carlito" w:cs="Carlito"/>
+          <w:b/>
+          <w:bCs/>
+          <w:color w:val="D86DCB" w:themeColor="accent5" w:themeTint="99"/>
+          <w:sz w:val="34"/>
+          <w:szCs w:val="34"/>
+        </w:rPr>
+      </w:pPr>
+      <w:r>
+        <w:rPr>
+          <w:rFonts w:ascii="Carlito" w:hAnsi="Carlito" w:cs="Carlito"/>
           <w:b/>
           <w:bCs/>
           <w:color w:val="D86DCB" w:themeColor="accent5" w:themeTint="99"/>
@@ -1031,25 +1071,25 @@
         <w:spacing w:line="240" w:lineRule="auto"/>
         <w:jc w:val="both"/>
         <w:rPr>
-          <w:rFonts w:ascii="Calibri" w:hAnsi="Calibri" w:cs="Calibri"/>
-          <w:sz w:val="34"/>
-          <w:szCs w:val="34"/>
-        </w:rPr>
-      </w:pPr>
-    </w:p>
-    <w:p>
-      <w:pPr>
-        <w:spacing w:line="240" w:lineRule="auto"/>
-        <w:jc w:val="both"/>
-        <w:rPr>
-          <w:rFonts w:ascii="Calibri" w:hAnsi="Calibri" w:cs="Calibri"/>
-          <w:sz w:val="34"/>
-          <w:szCs w:val="34"/>
-        </w:rPr>
-      </w:pPr>
-      <w:r>
-        <w:rPr>
-          <w:rFonts w:ascii="Calibri" w:hAnsi="Calibri" w:cs="Calibri"/>
+          <w:rFonts w:ascii="Carlito" w:hAnsi="Carlito" w:cs="Carlito"/>
+          <w:sz w:val="34"/>
+          <w:szCs w:val="34"/>
+        </w:rPr>
+      </w:pPr>
+    </w:p>
+    <w:p>
+      <w:pPr>
+        <w:spacing w:line="240" w:lineRule="auto"/>
+        <w:jc w:val="both"/>
+        <w:rPr>
+          <w:rFonts w:ascii="Carlito" w:hAnsi="Carlito" w:cs="Carlito"/>
+          <w:sz w:val="34"/>
+          <w:szCs w:val="34"/>
+        </w:rPr>
+      </w:pPr>
+      <w:r>
+        <w:rPr>
+          <w:rFonts w:ascii="Carlito" w:hAnsi="Carlito" w:cs="Carlito"/>
           <w:sz w:val="34"/>
           <w:szCs w:val="34"/>
         </w:rPr>
@@ -1061,16 +1101,16 @@
         <w:spacing w:line="240" w:lineRule="auto"/>
         <w:jc w:val="both"/>
         <w:rPr>
-          <w:rFonts w:ascii="Calibri" w:hAnsi="Calibri" w:cs="Calibri"/>
-          <w:b/>
-          <w:bCs/>
-          <w:sz w:val="34"/>
-          <w:szCs w:val="34"/>
-        </w:rPr>
-      </w:pPr>
-      <w:r>
-        <w:rPr>
-          <w:rFonts w:ascii="Calibri" w:hAnsi="Calibri" w:cs="Calibri"/>
+          <w:rFonts w:ascii="Carlito" w:hAnsi="Carlito" w:cs="Carlito"/>
+          <w:b/>
+          <w:bCs/>
+          <w:sz w:val="34"/>
+          <w:szCs w:val="34"/>
+        </w:rPr>
+      </w:pPr>
+      <w:r>
+        <w:rPr>
+          <w:rFonts w:ascii="Carlito" w:hAnsi="Carlito" w:cs="Carlito"/>
           <w:sz w:val="34"/>
           <w:szCs w:val="34"/>
         </w:rPr>
@@ -1082,17 +1122,17 @@
         <w:spacing w:line="240" w:lineRule="auto"/>
         <w:jc w:val="both"/>
         <w:rPr>
-          <w:rFonts w:ascii="Calibri" w:hAnsi="Calibri" w:cs="Calibri"/>
-          <w:b/>
-          <w:bCs/>
-          <w:color w:val="D86DCB" w:themeColor="accent5" w:themeTint="99"/>
-          <w:sz w:val="34"/>
-          <w:szCs w:val="34"/>
-        </w:rPr>
-      </w:pPr>
-      <w:r>
-        <w:rPr>
-          <w:rFonts w:ascii="Calibri" w:hAnsi="Calibri" w:cs="Calibri"/>
+          <w:rFonts w:ascii="Carlito" w:hAnsi="Carlito" w:cs="Carlito"/>
+          <w:b/>
+          <w:bCs/>
+          <w:color w:val="D86DCB" w:themeColor="accent5" w:themeTint="99"/>
+          <w:sz w:val="34"/>
+          <w:szCs w:val="34"/>
+        </w:rPr>
+      </w:pPr>
+      <w:r>
+        <w:rPr>
+          <w:rFonts w:ascii="Carlito" w:hAnsi="Carlito" w:cs="Carlito"/>
           <w:b/>
           <w:bCs/>
           <w:color w:val="D86DCB" w:themeColor="accent5" w:themeTint="99"/>
@@ -1107,17 +1147,17 @@
         <w:spacing w:line="240" w:lineRule="auto"/>
         <w:jc w:val="both"/>
         <w:rPr>
-          <w:rFonts w:ascii="Calibri" w:hAnsi="Calibri" w:cs="Calibri"/>
-          <w:b/>
-          <w:bCs/>
-          <w:color w:val="D86DCB" w:themeColor="accent5" w:themeTint="99"/>
-          <w:sz w:val="34"/>
-          <w:szCs w:val="34"/>
-        </w:rPr>
-      </w:pPr>
-      <w:r>
-        <w:rPr>
-          <w:rFonts w:ascii="Calibri" w:hAnsi="Calibri" w:cs="Calibri"/>
+          <w:rFonts w:ascii="Carlito" w:hAnsi="Carlito" w:cs="Carlito"/>
+          <w:b/>
+          <w:bCs/>
+          <w:color w:val="D86DCB" w:themeColor="accent5" w:themeTint="99"/>
+          <w:sz w:val="34"/>
+          <w:szCs w:val="34"/>
+        </w:rPr>
+      </w:pPr>
+      <w:r>
+        <w:rPr>
+          <w:rFonts w:ascii="Carlito" w:hAnsi="Carlito" w:cs="Carlito"/>
           <w:b/>
           <w:bCs/>
           <w:color w:val="D86DCB" w:themeColor="accent5" w:themeTint="99"/>
@@ -1132,17 +1172,17 @@
         <w:spacing w:line="240" w:lineRule="auto"/>
         <w:jc w:val="both"/>
         <w:rPr>
-          <w:rFonts w:ascii="Calibri" w:hAnsi="Calibri" w:cs="Calibri"/>
-          <w:b/>
-          <w:bCs/>
-          <w:color w:val="D86DCB" w:themeColor="accent5" w:themeTint="99"/>
-          <w:sz w:val="34"/>
-          <w:szCs w:val="34"/>
-        </w:rPr>
-      </w:pPr>
-      <w:r>
-        <w:rPr>
-          <w:rFonts w:ascii="Calibri" w:hAnsi="Calibri" w:cs="Calibri"/>
+          <w:rFonts w:ascii="Carlito" w:hAnsi="Carlito" w:cs="Carlito"/>
+          <w:b/>
+          <w:bCs/>
+          <w:color w:val="D86DCB" w:themeColor="accent5" w:themeTint="99"/>
+          <w:sz w:val="34"/>
+          <w:szCs w:val="34"/>
+        </w:rPr>
+      </w:pPr>
+      <w:r>
+        <w:rPr>
+          <w:rFonts w:ascii="Carlito" w:hAnsi="Carlito" w:cs="Carlito"/>
           <w:b/>
           <w:bCs/>
           <w:color w:val="D86DCB" w:themeColor="accent5" w:themeTint="99"/>
@@ -1157,14 +1197,14 @@
         <w:spacing w:line="240" w:lineRule="auto"/>
         <w:jc w:val="both"/>
         <w:rPr>
-          <w:rFonts w:ascii="Calibri" w:hAnsi="Calibri" w:cs="Calibri"/>
-          <w:sz w:val="34"/>
-          <w:szCs w:val="34"/>
-        </w:rPr>
-      </w:pPr>
-      <w:r>
-        <w:rPr>
-          <w:rFonts w:ascii="Calibri" w:hAnsi="Calibri" w:cs="Calibri"/>
+          <w:rFonts w:ascii="Carlito" w:hAnsi="Carlito" w:cs="Carlito"/>
+          <w:sz w:val="34"/>
+          <w:szCs w:val="34"/>
+        </w:rPr>
+      </w:pPr>
+      <w:r>
+        <w:rPr>
+          <w:rFonts w:ascii="Carlito" w:hAnsi="Carlito" w:cs="Carlito"/>
           <w:sz w:val="34"/>
           <w:szCs w:val="34"/>
         </w:rPr>
@@ -1172,7 +1212,7 @@
       </w:r>
       <w:r>
         <w:rPr>
-          <w:rFonts w:ascii="Calibri" w:hAnsi="Calibri" w:cs="Calibri"/>
+          <w:rFonts w:ascii="Carlito" w:hAnsi="Carlito" w:cs="Carlito"/>
           <w:b/>
           <w:bCs/>
           <w:sz w:val="34"/>
@@ -1182,7 +1222,7 @@
       </w:r>
       <w:r>
         <w:rPr>
-          <w:rFonts w:ascii="Calibri" w:hAnsi="Calibri" w:cs="Calibri"/>
+          <w:rFonts w:ascii="Carlito" w:hAnsi="Carlito" w:cs="Carlito"/>
           <w:sz w:val="34"/>
           <w:szCs w:val="34"/>
         </w:rPr>
@@ -1194,17 +1234,17 @@
         <w:spacing w:line="240" w:lineRule="auto"/>
         <w:jc w:val="both"/>
         <w:rPr>
-          <w:rFonts w:ascii="Calibri" w:hAnsi="Calibri" w:cs="Calibri"/>
-          <w:b/>
-          <w:bCs/>
-          <w:color w:val="D86DCB" w:themeColor="accent5" w:themeTint="99"/>
-          <w:sz w:val="34"/>
-          <w:szCs w:val="34"/>
-        </w:rPr>
-      </w:pPr>
-      <w:r>
-        <w:rPr>
-          <w:rFonts w:ascii="Calibri" w:hAnsi="Calibri" w:cs="Calibri"/>
+          <w:rFonts w:ascii="Carlito" w:hAnsi="Carlito" w:cs="Carlito"/>
+          <w:b/>
+          <w:bCs/>
+          <w:color w:val="D86DCB" w:themeColor="accent5" w:themeTint="99"/>
+          <w:sz w:val="34"/>
+          <w:szCs w:val="34"/>
+        </w:rPr>
+      </w:pPr>
+      <w:r>
+        <w:rPr>
+          <w:rFonts w:ascii="Carlito" w:hAnsi="Carlito" w:cs="Carlito"/>
           <w:b/>
           <w:bCs/>
           <w:color w:val="D86DCB" w:themeColor="accent5" w:themeTint="99"/>
@@ -1219,17 +1259,17 @@
         <w:spacing w:line="240" w:lineRule="auto"/>
         <w:jc w:val="both"/>
         <w:rPr>
-          <w:rFonts w:ascii="Calibri" w:hAnsi="Calibri" w:cs="Calibri"/>
-          <w:b/>
-          <w:bCs/>
-          <w:color w:val="D86DCB" w:themeColor="accent5" w:themeTint="99"/>
-          <w:sz w:val="34"/>
-          <w:szCs w:val="34"/>
-        </w:rPr>
-      </w:pPr>
-      <w:r>
-        <w:rPr>
-          <w:rFonts w:ascii="Calibri" w:hAnsi="Calibri" w:cs="Calibri"/>
+          <w:rFonts w:ascii="Carlito" w:hAnsi="Carlito" w:cs="Carlito"/>
+          <w:b/>
+          <w:bCs/>
+          <w:color w:val="D86DCB" w:themeColor="accent5" w:themeTint="99"/>
+          <w:sz w:val="34"/>
+          <w:szCs w:val="34"/>
+        </w:rPr>
+      </w:pPr>
+      <w:r>
+        <w:rPr>
+          <w:rFonts w:ascii="Carlito" w:hAnsi="Carlito" w:cs="Carlito"/>
           <w:b/>
           <w:bCs/>
           <w:color w:val="D86DCB" w:themeColor="accent5" w:themeTint="99"/>
@@ -1244,25 +1284,25 @@
         <w:spacing w:line="240" w:lineRule="auto"/>
         <w:jc w:val="both"/>
         <w:rPr>
-          <w:rFonts w:ascii="Calibri" w:hAnsi="Calibri" w:cs="Calibri"/>
-          <w:sz w:val="34"/>
-          <w:szCs w:val="34"/>
-        </w:rPr>
-      </w:pPr>
-    </w:p>
-    <w:p>
-      <w:pPr>
-        <w:spacing w:line="240" w:lineRule="auto"/>
-        <w:jc w:val="both"/>
-        <w:rPr>
-          <w:rFonts w:ascii="Calibri" w:hAnsi="Calibri" w:cs="Calibri"/>
-          <w:sz w:val="34"/>
-          <w:szCs w:val="34"/>
-        </w:rPr>
-      </w:pPr>
-      <w:r>
-        <w:rPr>
-          <w:rFonts w:ascii="Calibri" w:hAnsi="Calibri" w:cs="Calibri"/>
+          <w:rFonts w:ascii="Carlito" w:hAnsi="Carlito" w:cs="Carlito"/>
+          <w:sz w:val="34"/>
+          <w:szCs w:val="34"/>
+        </w:rPr>
+      </w:pPr>
+    </w:p>
+    <w:p>
+      <w:pPr>
+        <w:spacing w:line="240" w:lineRule="auto"/>
+        <w:jc w:val="both"/>
+        <w:rPr>
+          <w:rFonts w:ascii="Carlito" w:hAnsi="Carlito" w:cs="Carlito"/>
+          <w:sz w:val="34"/>
+          <w:szCs w:val="34"/>
+        </w:rPr>
+      </w:pPr>
+      <w:r>
+        <w:rPr>
+          <w:rFonts w:ascii="Carlito" w:hAnsi="Carlito" w:cs="Carlito"/>
           <w:sz w:val="34"/>
           <w:szCs w:val="34"/>
         </w:rPr>
@@ -1274,14 +1314,14 @@
         <w:spacing w:line="240" w:lineRule="auto"/>
         <w:jc w:val="both"/>
         <w:rPr>
-          <w:rFonts w:ascii="Calibri" w:hAnsi="Calibri" w:cs="Calibri"/>
-          <w:sz w:val="34"/>
-          <w:szCs w:val="34"/>
-        </w:rPr>
-      </w:pPr>
-      <w:r>
-        <w:rPr>
-          <w:rFonts w:ascii="Calibri" w:hAnsi="Calibri" w:cs="Calibri"/>
+          <w:rFonts w:ascii="Carlito" w:hAnsi="Carlito" w:cs="Carlito"/>
+          <w:sz w:val="34"/>
+          <w:szCs w:val="34"/>
+        </w:rPr>
+      </w:pPr>
+      <w:r>
+        <w:rPr>
+          <w:rFonts w:ascii="Carlito" w:hAnsi="Carlito" w:cs="Carlito"/>
           <w:sz w:val="34"/>
           <w:szCs w:val="34"/>
         </w:rPr>
@@ -1289,7 +1329,7 @@
       </w:r>
       <w:r>
         <w:rPr>
-          <w:rFonts w:ascii="Calibri" w:hAnsi="Calibri" w:cs="Calibri"/>
+          <w:rFonts w:ascii="Carlito" w:hAnsi="Carlito" w:cs="Carlito"/>
           <w:b/>
           <w:bCs/>
           <w:sz w:val="34"/>
@@ -1299,7 +1339,7 @@
       </w:r>
       <w:r>
         <w:rPr>
-          <w:rFonts w:ascii="Calibri" w:hAnsi="Calibri" w:cs="Calibri"/>
+          <w:rFonts w:ascii="Carlito" w:hAnsi="Carlito" w:cs="Carlito"/>
           <w:sz w:val="34"/>
           <w:szCs w:val="34"/>
         </w:rPr>
@@ -1307,7 +1347,7 @@
       </w:r>
       <w:r>
         <w:rPr>
-          <w:rFonts w:ascii="Calibri" w:hAnsi="Calibri" w:cs="Calibri"/>
+          <w:rFonts w:ascii="Carlito" w:hAnsi="Carlito" w:cs="Carlito"/>
           <w:b/>
           <w:bCs/>
           <w:sz w:val="34"/>
@@ -1317,7 +1357,7 @@
       </w:r>
       <w:r>
         <w:rPr>
-          <w:rFonts w:ascii="Calibri" w:hAnsi="Calibri" w:cs="Calibri"/>
+          <w:rFonts w:ascii="Carlito" w:hAnsi="Carlito" w:cs="Carlito"/>
           <w:sz w:val="34"/>
           <w:szCs w:val="34"/>
         </w:rPr>
@@ -1329,17 +1369,17 @@
         <w:spacing w:line="240" w:lineRule="auto"/>
         <w:jc w:val="both"/>
         <w:rPr>
-          <w:rFonts w:ascii="Calibri" w:hAnsi="Calibri" w:cs="Calibri"/>
-          <w:b/>
-          <w:bCs/>
-          <w:color w:val="D86DCB" w:themeColor="accent5" w:themeTint="99"/>
-          <w:sz w:val="34"/>
-          <w:szCs w:val="34"/>
-        </w:rPr>
-      </w:pPr>
-      <w:r>
-        <w:rPr>
-          <w:rFonts w:ascii="Calibri" w:hAnsi="Calibri" w:cs="Calibri"/>
+          <w:rFonts w:ascii="Carlito" w:hAnsi="Carlito" w:cs="Carlito"/>
+          <w:b/>
+          <w:bCs/>
+          <w:color w:val="D86DCB" w:themeColor="accent5" w:themeTint="99"/>
+          <w:sz w:val="34"/>
+          <w:szCs w:val="34"/>
+        </w:rPr>
+      </w:pPr>
+      <w:r>
+        <w:rPr>
+          <w:rFonts w:ascii="Carlito" w:hAnsi="Carlito" w:cs="Carlito"/>
           <w:b/>
           <w:bCs/>
           <w:color w:val="D86DCB" w:themeColor="accent5" w:themeTint="99"/>
@@ -1354,17 +1394,17 @@
         <w:spacing w:line="240" w:lineRule="auto"/>
         <w:jc w:val="both"/>
         <w:rPr>
-          <w:rFonts w:ascii="Calibri" w:hAnsi="Calibri" w:cs="Calibri"/>
-          <w:b/>
-          <w:bCs/>
-          <w:color w:val="D86DCB" w:themeColor="accent5" w:themeTint="99"/>
-          <w:sz w:val="34"/>
-          <w:szCs w:val="34"/>
-        </w:rPr>
-      </w:pPr>
-      <w:r>
-        <w:rPr>
-          <w:rFonts w:ascii="Calibri" w:hAnsi="Calibri" w:cs="Calibri"/>
+          <w:rFonts w:ascii="Carlito" w:hAnsi="Carlito" w:cs="Carlito"/>
+          <w:b/>
+          <w:bCs/>
+          <w:color w:val="D86DCB" w:themeColor="accent5" w:themeTint="99"/>
+          <w:sz w:val="34"/>
+          <w:szCs w:val="34"/>
+        </w:rPr>
+      </w:pPr>
+      <w:r>
+        <w:rPr>
+          <w:rFonts w:ascii="Carlito" w:hAnsi="Carlito" w:cs="Carlito"/>
           <w:b/>
           <w:bCs/>
           <w:color w:val="D86DCB" w:themeColor="accent5" w:themeTint="99"/>
@@ -1379,17 +1419,17 @@
         <w:spacing w:line="240" w:lineRule="auto"/>
         <w:jc w:val="both"/>
         <w:rPr>
-          <w:rFonts w:ascii="Calibri" w:hAnsi="Calibri" w:cs="Calibri"/>
-          <w:b/>
-          <w:bCs/>
-          <w:color w:val="D86DCB" w:themeColor="accent5" w:themeTint="99"/>
-          <w:sz w:val="34"/>
-          <w:szCs w:val="34"/>
-        </w:rPr>
-      </w:pPr>
-      <w:r>
-        <w:rPr>
-          <w:rFonts w:ascii="Calibri" w:hAnsi="Calibri" w:cs="Calibri"/>
+          <w:rFonts w:ascii="Carlito" w:hAnsi="Carlito" w:cs="Carlito"/>
+          <w:b/>
+          <w:bCs/>
+          <w:color w:val="D86DCB" w:themeColor="accent5" w:themeTint="99"/>
+          <w:sz w:val="34"/>
+          <w:szCs w:val="34"/>
+        </w:rPr>
+      </w:pPr>
+      <w:r>
+        <w:rPr>
+          <w:rFonts w:ascii="Carlito" w:hAnsi="Carlito" w:cs="Carlito"/>
           <w:b/>
           <w:bCs/>
           <w:color w:val="D86DCB" w:themeColor="accent5" w:themeTint="99"/>
@@ -1404,25 +1444,25 @@
         <w:spacing w:line="240" w:lineRule="auto"/>
         <w:jc w:val="both"/>
         <w:rPr>
-          <w:rFonts w:ascii="Calibri" w:hAnsi="Calibri" w:cs="Calibri"/>
-          <w:sz w:val="34"/>
-          <w:szCs w:val="34"/>
-        </w:rPr>
-      </w:pPr>
-    </w:p>
-    <w:p>
-      <w:pPr>
-        <w:spacing w:line="240" w:lineRule="auto"/>
-        <w:jc w:val="both"/>
-        <w:rPr>
-          <w:rFonts w:ascii="Calibri" w:hAnsi="Calibri" w:cs="Calibri"/>
-          <w:sz w:val="34"/>
-          <w:szCs w:val="34"/>
-        </w:rPr>
-      </w:pPr>
-      <w:r>
-        <w:rPr>
-          <w:rFonts w:ascii="Calibri" w:hAnsi="Calibri" w:cs="Calibri"/>
+          <w:rFonts w:ascii="Carlito" w:hAnsi="Carlito" w:cs="Carlito"/>
+          <w:sz w:val="34"/>
+          <w:szCs w:val="34"/>
+        </w:rPr>
+      </w:pPr>
+    </w:p>
+    <w:p>
+      <w:pPr>
+        <w:spacing w:line="240" w:lineRule="auto"/>
+        <w:jc w:val="both"/>
+        <w:rPr>
+          <w:rFonts w:ascii="Carlito" w:hAnsi="Carlito" w:cs="Carlito"/>
+          <w:sz w:val="34"/>
+          <w:szCs w:val="34"/>
+        </w:rPr>
+      </w:pPr>
+      <w:r>
+        <w:rPr>
+          <w:rFonts w:ascii="Carlito" w:hAnsi="Carlito" w:cs="Carlito"/>
           <w:sz w:val="34"/>
           <w:szCs w:val="34"/>
         </w:rPr>
@@ -1435,14 +1475,14 @@
         <w:spacing w:line="240" w:lineRule="auto"/>
         <w:jc w:val="both"/>
         <w:rPr>
-          <w:rFonts w:ascii="Calibri" w:hAnsi="Calibri" w:cs="Calibri"/>
-          <w:sz w:val="34"/>
-          <w:szCs w:val="34"/>
-        </w:rPr>
-      </w:pPr>
-      <w:r>
-        <w:rPr>
-          <w:rFonts w:ascii="Calibri" w:hAnsi="Calibri" w:cs="Calibri"/>
+          <w:rFonts w:ascii="Carlito" w:hAnsi="Carlito" w:cs="Carlito"/>
+          <w:sz w:val="34"/>
+          <w:szCs w:val="34"/>
+        </w:rPr>
+      </w:pPr>
+      <w:r>
+        <w:rPr>
+          <w:rFonts w:ascii="Carlito" w:hAnsi="Carlito" w:cs="Carlito"/>
           <w:sz w:val="34"/>
           <w:szCs w:val="34"/>
         </w:rPr>
@@ -1450,7 +1490,7 @@
       </w:r>
       <w:r>
         <w:rPr>
-          <w:rFonts w:ascii="Calibri" w:hAnsi="Calibri" w:cs="Calibri"/>
+          <w:rFonts w:ascii="Carlito" w:hAnsi="Carlito" w:cs="Carlito"/>
           <w:b/>
           <w:bCs/>
           <w:sz w:val="34"/>
@@ -1460,7 +1500,7 @@
       </w:r>
       <w:r>
         <w:rPr>
-          <w:rFonts w:ascii="Calibri" w:hAnsi="Calibri" w:cs="Calibri"/>
+          <w:rFonts w:ascii="Carlito" w:hAnsi="Carlito" w:cs="Carlito"/>
           <w:sz w:val="34"/>
           <w:szCs w:val="34"/>
         </w:rPr>
@@ -1472,7 +1512,7 @@
         <w:spacing w:line="240" w:lineRule="auto"/>
         <w:jc w:val="both"/>
         <w:rPr>
-          <w:rFonts w:ascii="Calibri" w:hAnsi="Calibri" w:cs="Calibri"/>
+          <w:rFonts w:ascii="Carlito" w:hAnsi="Carlito" w:cs="Carlito"/>
           <w:b/>
           <w:bCs/>
           <w:sz w:val="30"/>
@@ -1481,7 +1521,7 @@
       </w:pPr>
       <w:r>
         <w:rPr>
-          <w:rFonts w:ascii="Calibri" w:hAnsi="Calibri" w:cs="Calibri"/>
+          <w:rFonts w:ascii="Carlito" w:hAnsi="Carlito" w:cs="Carlito"/>
           <w:b/>
           <w:bCs/>
           <w:sz w:val="30"/>
@@ -1495,7 +1535,7 @@
         <w:spacing w:line="240" w:lineRule="auto"/>
         <w:jc w:val="both"/>
         <w:rPr>
-          <w:rFonts w:ascii="Calibri" w:hAnsi="Calibri" w:cs="Calibri"/>
+          <w:rFonts w:ascii="Carlito" w:hAnsi="Carlito" w:cs="Carlito"/>
           <w:b/>
           <w:bCs/>
           <w:sz w:val="30"/>
@@ -1504,7 +1544,7 @@
       </w:pPr>
       <w:r>
         <w:rPr>
-          <w:rFonts w:ascii="Calibri" w:hAnsi="Calibri" w:cs="Calibri"/>
+          <w:rFonts w:ascii="Carlito" w:hAnsi="Carlito" w:cs="Carlito"/>
           <w:b/>
           <w:bCs/>
           <w:sz w:val="30"/>
@@ -1518,7 +1558,7 @@
         <w:spacing w:line="240" w:lineRule="auto"/>
         <w:jc w:val="both"/>
         <w:rPr>
-          <w:rFonts w:ascii="Calibri" w:hAnsi="Calibri" w:cs="Calibri"/>
+          <w:rFonts w:ascii="Carlito" w:hAnsi="Carlito" w:cs="Carlito"/>
           <w:b/>
           <w:bCs/>
           <w:sz w:val="30"/>
@@ -1527,7 +1567,7 @@
       </w:pPr>
       <w:r>
         <w:rPr>
-          <w:rFonts w:ascii="Calibri" w:hAnsi="Calibri" w:cs="Calibri"/>
+          <w:rFonts w:ascii="Carlito" w:hAnsi="Carlito" w:cs="Carlito"/>
           <w:b/>
           <w:bCs/>
           <w:sz w:val="30"/>
@@ -1541,14 +1581,14 @@
         <w:spacing w:line="240" w:lineRule="auto"/>
         <w:jc w:val="both"/>
         <w:rPr>
-          <w:rFonts w:ascii="Calibri" w:hAnsi="Calibri" w:cs="Calibri"/>
-          <w:sz w:val="34"/>
-          <w:szCs w:val="34"/>
-        </w:rPr>
-      </w:pPr>
-      <w:r>
-        <w:rPr>
-          <w:rFonts w:ascii="Calibri" w:hAnsi="Calibri" w:cs="Calibri"/>
+          <w:rFonts w:ascii="Carlito" w:hAnsi="Carlito" w:cs="Carlito"/>
+          <w:sz w:val="34"/>
+          <w:szCs w:val="34"/>
+        </w:rPr>
+      </w:pPr>
+      <w:r>
+        <w:rPr>
+          <w:rFonts w:ascii="Carlito" w:hAnsi="Carlito" w:cs="Carlito"/>
           <w:sz w:val="34"/>
           <w:szCs w:val="34"/>
         </w:rPr>
@@ -1560,17 +1600,17 @@
         <w:spacing w:line="240" w:lineRule="auto"/>
         <w:jc w:val="both"/>
         <w:rPr>
-          <w:rFonts w:ascii="Calibri" w:hAnsi="Calibri" w:cs="Calibri"/>
-          <w:b/>
-          <w:bCs/>
-          <w:color w:val="D86DCB" w:themeColor="accent5" w:themeTint="99"/>
-          <w:sz w:val="34"/>
-          <w:szCs w:val="34"/>
-        </w:rPr>
-      </w:pPr>
-      <w:r>
-        <w:rPr>
-          <w:rFonts w:ascii="Calibri" w:hAnsi="Calibri" w:cs="Calibri"/>
+          <w:rFonts w:ascii="Carlito" w:hAnsi="Carlito" w:cs="Carlito"/>
+          <w:b/>
+          <w:bCs/>
+          <w:color w:val="D86DCB" w:themeColor="accent5" w:themeTint="99"/>
+          <w:sz w:val="34"/>
+          <w:szCs w:val="34"/>
+        </w:rPr>
+      </w:pPr>
+      <w:r>
+        <w:rPr>
+          <w:rFonts w:ascii="Carlito" w:hAnsi="Carlito" w:cs="Carlito"/>
           <w:b/>
           <w:bCs/>
           <w:color w:val="D86DCB" w:themeColor="accent5" w:themeTint="99"/>
@@ -1585,17 +1625,17 @@
         <w:spacing w:line="240" w:lineRule="auto"/>
         <w:jc w:val="both"/>
         <w:rPr>
-          <w:rFonts w:ascii="Calibri" w:hAnsi="Calibri" w:cs="Calibri"/>
-          <w:b/>
-          <w:bCs/>
-          <w:color w:val="D86DCB" w:themeColor="accent5" w:themeTint="99"/>
-          <w:sz w:val="34"/>
-          <w:szCs w:val="34"/>
-        </w:rPr>
-      </w:pPr>
-      <w:r>
-        <w:rPr>
-          <w:rFonts w:ascii="Calibri" w:hAnsi="Calibri" w:cs="Calibri"/>
+          <w:rFonts w:ascii="Carlito" w:hAnsi="Carlito" w:cs="Carlito"/>
+          <w:b/>
+          <w:bCs/>
+          <w:color w:val="D86DCB" w:themeColor="accent5" w:themeTint="99"/>
+          <w:sz w:val="34"/>
+          <w:szCs w:val="34"/>
+        </w:rPr>
+      </w:pPr>
+      <w:r>
+        <w:rPr>
+          <w:rFonts w:ascii="Carlito" w:hAnsi="Carlito" w:cs="Carlito"/>
           <w:b/>
           <w:bCs/>
           <w:color w:val="D86DCB" w:themeColor="accent5" w:themeTint="99"/>
@@ -1610,17 +1650,17 @@
         <w:spacing w:line="240" w:lineRule="auto"/>
         <w:jc w:val="both"/>
         <w:rPr>
-          <w:rFonts w:ascii="Calibri" w:hAnsi="Calibri" w:cs="Calibri"/>
-          <w:b/>
-          <w:bCs/>
-          <w:color w:val="D86DCB" w:themeColor="accent5" w:themeTint="99"/>
-          <w:sz w:val="34"/>
-          <w:szCs w:val="34"/>
-        </w:rPr>
-      </w:pPr>
-      <w:r>
-        <w:rPr>
-          <w:rFonts w:ascii="Calibri" w:hAnsi="Calibri" w:cs="Calibri"/>
+          <w:rFonts w:ascii="Carlito" w:hAnsi="Carlito" w:cs="Carlito"/>
+          <w:b/>
+          <w:bCs/>
+          <w:color w:val="D86DCB" w:themeColor="accent5" w:themeTint="99"/>
+          <w:sz w:val="34"/>
+          <w:szCs w:val="34"/>
+        </w:rPr>
+      </w:pPr>
+      <w:r>
+        <w:rPr>
+          <w:rFonts w:ascii="Carlito" w:hAnsi="Carlito" w:cs="Carlito"/>
           <w:b/>
           <w:bCs/>
           <w:color w:val="D86DCB" w:themeColor="accent5" w:themeTint="99"/>
@@ -1635,17 +1675,17 @@
         <w:spacing w:line="240" w:lineRule="auto"/>
         <w:jc w:val="both"/>
         <w:rPr>
-          <w:rFonts w:ascii="Calibri" w:hAnsi="Calibri" w:cs="Calibri"/>
-          <w:b/>
-          <w:bCs/>
-          <w:color w:val="D86DCB" w:themeColor="accent5" w:themeTint="99"/>
-          <w:sz w:val="34"/>
-          <w:szCs w:val="34"/>
-        </w:rPr>
-      </w:pPr>
-      <w:r>
-        <w:rPr>
-          <w:rFonts w:ascii="Calibri" w:hAnsi="Calibri" w:cs="Calibri"/>
+          <w:rFonts w:ascii="Carlito" w:hAnsi="Carlito" w:cs="Carlito"/>
+          <w:b/>
+          <w:bCs/>
+          <w:color w:val="D86DCB" w:themeColor="accent5" w:themeTint="99"/>
+          <w:sz w:val="34"/>
+          <w:szCs w:val="34"/>
+        </w:rPr>
+      </w:pPr>
+      <w:r>
+        <w:rPr>
+          <w:rFonts w:ascii="Carlito" w:hAnsi="Carlito" w:cs="Carlito"/>
           <w:b/>
           <w:bCs/>
           <w:color w:val="D86DCB" w:themeColor="accent5" w:themeTint="99"/>
@@ -1660,25 +1700,25 @@
         <w:spacing w:line="240" w:lineRule="auto"/>
         <w:jc w:val="both"/>
         <w:rPr>
-          <w:rFonts w:ascii="Calibri" w:hAnsi="Calibri" w:cs="Calibri"/>
-          <w:sz w:val="34"/>
-          <w:szCs w:val="34"/>
-        </w:rPr>
-      </w:pPr>
-    </w:p>
-    <w:p>
-      <w:pPr>
-        <w:spacing w:line="240" w:lineRule="auto"/>
-        <w:jc w:val="both"/>
-        <w:rPr>
-          <w:rFonts w:ascii="Calibri" w:hAnsi="Calibri" w:cs="Calibri"/>
-          <w:sz w:val="34"/>
-          <w:szCs w:val="34"/>
-        </w:rPr>
-      </w:pPr>
-      <w:r>
-        <w:rPr>
-          <w:rFonts w:ascii="Calibri" w:hAnsi="Calibri" w:cs="Calibri"/>
+          <w:rFonts w:ascii="Carlito" w:hAnsi="Carlito" w:cs="Carlito"/>
+          <w:sz w:val="34"/>
+          <w:szCs w:val="34"/>
+        </w:rPr>
+      </w:pPr>
+    </w:p>
+    <w:p>
+      <w:pPr>
+        <w:spacing w:line="240" w:lineRule="auto"/>
+        <w:jc w:val="both"/>
+        <w:rPr>
+          <w:rFonts w:ascii="Carlito" w:hAnsi="Carlito" w:cs="Carlito"/>
+          <w:sz w:val="34"/>
+          <w:szCs w:val="34"/>
+        </w:rPr>
+      </w:pPr>
+      <w:r>
+        <w:rPr>
+          <w:rFonts w:ascii="Carlito" w:hAnsi="Carlito" w:cs="Carlito"/>
           <w:sz w:val="34"/>
           <w:szCs w:val="34"/>
         </w:rPr>
@@ -1696,14 +1736,14 @@
         <w:ind w:left="360"/>
         <w:jc w:val="both"/>
         <w:rPr>
-          <w:rFonts w:ascii="Calibri" w:hAnsi="Calibri" w:cs="Calibri"/>
-          <w:sz w:val="34"/>
-          <w:szCs w:val="34"/>
-        </w:rPr>
-      </w:pPr>
-      <w:r>
-        <w:rPr>
-          <w:rFonts w:ascii="Calibri" w:hAnsi="Calibri" w:cs="Calibri"/>
+          <w:rFonts w:ascii="Carlito" w:hAnsi="Carlito" w:cs="Carlito"/>
+          <w:sz w:val="34"/>
+          <w:szCs w:val="34"/>
+        </w:rPr>
+      </w:pPr>
+      <w:r>
+        <w:rPr>
+          <w:rFonts w:ascii="Carlito" w:hAnsi="Carlito" w:cs="Carlito"/>
           <w:sz w:val="34"/>
           <w:szCs w:val="34"/>
         </w:rPr>
@@ -1711,7 +1751,7 @@
       </w:r>
       <w:r>
         <w:rPr>
-          <w:rFonts w:ascii="Calibri" w:hAnsi="Calibri" w:cs="Calibri"/>
+          <w:rFonts w:ascii="Carlito" w:hAnsi="Carlito" w:cs="Carlito"/>
           <w:b/>
           <w:bCs/>
           <w:sz w:val="34"/>
@@ -1721,7 +1761,7 @@
       </w:r>
       <w:r>
         <w:rPr>
-          <w:rFonts w:ascii="Calibri" w:hAnsi="Calibri" w:cs="Calibri"/>
+          <w:rFonts w:ascii="Carlito" w:hAnsi="Carlito" w:cs="Carlito"/>
           <w:sz w:val="34"/>
           <w:szCs w:val="34"/>
         </w:rPr>
@@ -1739,14 +1779,14 @@
         <w:ind w:left="360"/>
         <w:jc w:val="both"/>
         <w:rPr>
-          <w:rFonts w:ascii="Calibri" w:hAnsi="Calibri" w:cs="Calibri"/>
-          <w:sz w:val="34"/>
-          <w:szCs w:val="34"/>
-        </w:rPr>
-      </w:pPr>
-      <w:r>
-        <w:rPr>
-          <w:rFonts w:ascii="Calibri" w:hAnsi="Calibri" w:cs="Calibri"/>
+          <w:rFonts w:ascii="Carlito" w:hAnsi="Carlito" w:cs="Carlito"/>
+          <w:sz w:val="34"/>
+          <w:szCs w:val="34"/>
+        </w:rPr>
+      </w:pPr>
+      <w:r>
+        <w:rPr>
+          <w:rFonts w:ascii="Carlito" w:hAnsi="Carlito" w:cs="Carlito"/>
           <w:sz w:val="34"/>
           <w:szCs w:val="34"/>
         </w:rPr>
@@ -1754,7 +1794,7 @@
       </w:r>
       <w:r>
         <w:rPr>
-          <w:rFonts w:ascii="Calibri" w:hAnsi="Calibri" w:cs="Calibri"/>
+          <w:rFonts w:ascii="Carlito" w:hAnsi="Carlito" w:cs="Carlito"/>
           <w:b/>
           <w:bCs/>
           <w:sz w:val="34"/>
@@ -1764,7 +1804,7 @@
       </w:r>
       <w:r>
         <w:rPr>
-          <w:rFonts w:ascii="Calibri" w:hAnsi="Calibri" w:cs="Calibri"/>
+          <w:rFonts w:ascii="Carlito" w:hAnsi="Carlito" w:cs="Carlito"/>
           <w:sz w:val="34"/>
           <w:szCs w:val="34"/>
         </w:rPr>
@@ -1782,14 +1822,14 @@
         <w:ind w:left="360"/>
         <w:jc w:val="both"/>
         <w:rPr>
-          <w:rFonts w:ascii="Calibri" w:hAnsi="Calibri" w:cs="Calibri"/>
-          <w:sz w:val="34"/>
-          <w:szCs w:val="34"/>
-        </w:rPr>
-      </w:pPr>
-      <w:r>
-        <w:rPr>
-          <w:rFonts w:ascii="Calibri" w:hAnsi="Calibri" w:cs="Calibri"/>
+          <w:rFonts w:ascii="Carlito" w:hAnsi="Carlito" w:cs="Carlito"/>
+          <w:sz w:val="34"/>
+          <w:szCs w:val="34"/>
+        </w:rPr>
+      </w:pPr>
+      <w:r>
+        <w:rPr>
+          <w:rFonts w:ascii="Carlito" w:hAnsi="Carlito" w:cs="Carlito"/>
           <w:sz w:val="34"/>
           <w:szCs w:val="34"/>
         </w:rPr>
@@ -1797,7 +1837,7 @@
       </w:r>
       <w:r>
         <w:rPr>
-          <w:rFonts w:ascii="Calibri" w:hAnsi="Calibri" w:cs="Calibri"/>
+          <w:rFonts w:ascii="Carlito" w:hAnsi="Carlito" w:cs="Carlito"/>
           <w:b/>
           <w:bCs/>
           <w:sz w:val="34"/>
@@ -1807,7 +1847,7 @@
       </w:r>
       <w:r>
         <w:rPr>
-          <w:rFonts w:ascii="Calibri" w:hAnsi="Calibri" w:cs="Calibri"/>
+          <w:rFonts w:ascii="Carlito" w:hAnsi="Carlito" w:cs="Carlito"/>
           <w:sz w:val="34"/>
           <w:szCs w:val="34"/>
         </w:rPr>
@@ -1825,14 +1865,14 @@
         <w:ind w:left="360"/>
         <w:jc w:val="both"/>
         <w:rPr>
-          <w:rFonts w:ascii="Calibri" w:hAnsi="Calibri" w:cs="Calibri"/>
-          <w:sz w:val="34"/>
-          <w:szCs w:val="34"/>
-        </w:rPr>
-      </w:pPr>
-      <w:r>
-        <w:rPr>
-          <w:rFonts w:ascii="Calibri" w:hAnsi="Calibri" w:cs="Calibri"/>
+          <w:rFonts w:ascii="Carlito" w:hAnsi="Carlito" w:cs="Carlito"/>
+          <w:sz w:val="34"/>
+          <w:szCs w:val="34"/>
+        </w:rPr>
+      </w:pPr>
+      <w:r>
+        <w:rPr>
+          <w:rFonts w:ascii="Carlito" w:hAnsi="Carlito" w:cs="Carlito"/>
           <w:sz w:val="34"/>
           <w:szCs w:val="34"/>
         </w:rPr>
@@ -1840,7 +1880,7 @@
       </w:r>
       <w:r>
         <w:rPr>
-          <w:rFonts w:ascii="Calibri" w:hAnsi="Calibri" w:cs="Calibri"/>
+          <w:rFonts w:ascii="Carlito" w:hAnsi="Carlito" w:cs="Carlito"/>
           <w:b/>
           <w:bCs/>
           <w:sz w:val="34"/>
@@ -1850,7 +1890,7 @@
       </w:r>
       <w:r>
         <w:rPr>
-          <w:rFonts w:ascii="Calibri" w:hAnsi="Calibri" w:cs="Calibri"/>
+          <w:rFonts w:ascii="Carlito" w:hAnsi="Carlito" w:cs="Carlito"/>
           <w:sz w:val="34"/>
           <w:szCs w:val="34"/>
         </w:rPr>
@@ -1858,7 +1898,7 @@
       </w:r>
       <w:r>
         <w:rPr>
-          <w:rFonts w:ascii="Calibri" w:hAnsi="Calibri" w:cs="Calibri"/>
+          <w:rFonts w:ascii="Carlito" w:hAnsi="Carlito" w:cs="Carlito"/>
           <w:b/>
           <w:bCs/>
           <w:sz w:val="34"/>
@@ -1868,7 +1908,7 @@
       </w:r>
       <w:r>
         <w:rPr>
-          <w:rFonts w:ascii="Calibri" w:hAnsi="Calibri" w:cs="Calibri"/>
+          <w:rFonts w:ascii="Carlito" w:hAnsi="Carlito" w:cs="Carlito"/>
           <w:sz w:val="34"/>
           <w:szCs w:val="34"/>
         </w:rPr>
@@ -1880,7 +1920,7 @@
         <w:spacing w:line="240" w:lineRule="auto"/>
         <w:jc w:val="both"/>
         <w:rPr>
-          <w:rFonts w:ascii="Calibri" w:hAnsi="Calibri" w:cs="Calibri"/>
+          <w:rFonts w:ascii="Carlito" w:hAnsi="Carlito" w:cs="Carlito"/>
           <w:sz w:val="34"/>
           <w:szCs w:val="34"/>
         </w:rPr>
@@ -1891,14 +1931,14 @@
         <w:spacing w:line="240" w:lineRule="auto"/>
         <w:jc w:val="center"/>
         <w:rPr>
-          <w:rFonts w:ascii="Calibri" w:hAnsi="Calibri" w:cs="Calibri"/>
-          <w:sz w:val="34"/>
-          <w:szCs w:val="34"/>
-        </w:rPr>
-      </w:pPr>
-      <w:r>
-        <w:rPr>
-          <w:rFonts w:ascii="Calibri" w:hAnsi="Calibri" w:cs="Calibri"/>
+          <w:rFonts w:ascii="Carlito" w:hAnsi="Carlito" w:cs="Carlito"/>
+          <w:sz w:val="34"/>
+          <w:szCs w:val="34"/>
+        </w:rPr>
+      </w:pPr>
+      <w:r>
+        <w:rPr>
+          <w:rFonts w:ascii="Carlito" w:hAnsi="Carlito" w:cs="Carlito"/>
           <w:sz w:val="34"/>
           <w:szCs w:val="34"/>
         </w:rPr>
@@ -1910,27 +1950,27 @@
         <w:spacing w:line="240" w:lineRule="auto"/>
         <w:jc w:val="both"/>
         <w:rPr>
-          <w:rFonts w:ascii="Calibri" w:hAnsi="Calibri" w:cs="Calibri"/>
-          <w:sz w:val="34"/>
-          <w:szCs w:val="34"/>
-        </w:rPr>
-      </w:pPr>
-    </w:p>
-    <w:p>
-      <w:pPr>
-        <w:spacing w:line="240" w:lineRule="auto"/>
-        <w:jc w:val="both"/>
-        <w:rPr>
-          <w:rFonts w:ascii="Calibri" w:hAnsi="Calibri" w:cs="Calibri"/>
-          <w:b/>
-          <w:bCs/>
-          <w:sz w:val="34"/>
-          <w:szCs w:val="34"/>
-        </w:rPr>
-      </w:pPr>
-      <w:r>
-        <w:rPr>
-          <w:rFonts w:ascii="Calibri" w:hAnsi="Calibri" w:cs="Calibri"/>
+          <w:rFonts w:ascii="Carlito" w:hAnsi="Carlito" w:cs="Carlito"/>
+          <w:sz w:val="34"/>
+          <w:szCs w:val="34"/>
+        </w:rPr>
+      </w:pPr>
+    </w:p>
+    <w:p>
+      <w:pPr>
+        <w:spacing w:line="240" w:lineRule="auto"/>
+        <w:jc w:val="both"/>
+        <w:rPr>
+          <w:rFonts w:ascii="Carlito" w:hAnsi="Carlito" w:cs="Carlito"/>
+          <w:b/>
+          <w:bCs/>
+          <w:sz w:val="34"/>
+          <w:szCs w:val="34"/>
+        </w:rPr>
+      </w:pPr>
+      <w:r>
+        <w:rPr>
+          <w:rFonts w:ascii="Carlito" w:hAnsi="Carlito" w:cs="Carlito"/>
           <w:b/>
           <w:bCs/>
           <w:sz w:val="34"/>
@@ -1940,7 +1980,7 @@
       </w:r>
       <w:r>
         <w:rPr>
-          <w:rFonts w:ascii="Calibri" w:hAnsi="Calibri" w:cs="Calibri"/>
+          <w:rFonts w:ascii="Carlito" w:hAnsi="Carlito" w:cs="Carlito"/>
           <w:b/>
           <w:bCs/>
           <w:sz w:val="34"/>
@@ -1950,7 +1990,7 @@
       </w:r>
       <w:r>
         <w:rPr>
-          <w:rFonts w:ascii="Calibri" w:hAnsi="Calibri" w:cs="Calibri"/>
+          <w:rFonts w:ascii="Carlito" w:hAnsi="Carlito" w:cs="Carlito"/>
           <w:b/>
           <w:bCs/>
           <w:sz w:val="34"/>
@@ -1964,14 +2004,14 @@
         <w:spacing w:line="240" w:lineRule="auto"/>
         <w:jc w:val="both"/>
         <w:rPr>
-          <w:rFonts w:ascii="Calibri" w:hAnsi="Calibri" w:cs="Calibri"/>
-          <w:sz w:val="34"/>
-          <w:szCs w:val="34"/>
-        </w:rPr>
-      </w:pPr>
-      <w:r>
-        <w:rPr>
-          <w:rFonts w:ascii="Calibri" w:hAnsi="Calibri" w:cs="Calibri"/>
+          <w:rFonts w:ascii="Carlito" w:hAnsi="Carlito" w:cs="Carlito"/>
+          <w:sz w:val="34"/>
+          <w:szCs w:val="34"/>
+        </w:rPr>
+      </w:pPr>
+      <w:r>
+        <w:rPr>
+          <w:rFonts w:ascii="Carlito" w:hAnsi="Carlito" w:cs="Carlito"/>
           <w:sz w:val="34"/>
           <w:szCs w:val="34"/>
         </w:rPr>
@@ -1979,7 +2019,7 @@
       </w:r>
       <w:r>
         <w:rPr>
-          <w:rFonts w:ascii="Calibri" w:hAnsi="Calibri" w:cs="Calibri"/>
+          <w:rFonts w:ascii="Carlito" w:hAnsi="Carlito" w:cs="Carlito"/>
           <w:sz w:val="34"/>
           <w:szCs w:val="34"/>
         </w:rPr>
@@ -1987,7 +2027,7 @@
       </w:r>
       <w:r>
         <w:rPr>
-          <w:rFonts w:ascii="Calibri" w:hAnsi="Calibri" w:cs="Calibri"/>
+          <w:rFonts w:ascii="Carlito" w:hAnsi="Carlito" w:cs="Carlito"/>
           <w:b/>
           <w:bCs/>
           <w:sz w:val="34"/>
@@ -1997,7 +2037,7 @@
       </w:r>
       <w:r>
         <w:rPr>
-          <w:rFonts w:ascii="Calibri" w:hAnsi="Calibri" w:cs="Calibri"/>
+          <w:rFonts w:ascii="Carlito" w:hAnsi="Carlito" w:cs="Carlito"/>
           <w:sz w:val="34"/>
           <w:szCs w:val="34"/>
         </w:rPr>
@@ -2009,14 +2049,14 @@
         <w:spacing w:line="240" w:lineRule="auto"/>
         <w:jc w:val="both"/>
         <w:rPr>
-          <w:rFonts w:ascii="Calibri" w:hAnsi="Calibri" w:cs="Calibri"/>
-          <w:sz w:val="34"/>
-          <w:szCs w:val="34"/>
-        </w:rPr>
-      </w:pPr>
-      <w:r>
-        <w:rPr>
-          <w:rFonts w:ascii="Calibri" w:hAnsi="Calibri" w:cs="Calibri"/>
+          <w:rFonts w:ascii="Carlito" w:hAnsi="Carlito" w:cs="Carlito"/>
+          <w:sz w:val="34"/>
+          <w:szCs w:val="34"/>
+        </w:rPr>
+      </w:pPr>
+      <w:r>
+        <w:rPr>
+          <w:rFonts w:ascii="Carlito" w:hAnsi="Carlito" w:cs="Carlito"/>
           <w:sz w:val="34"/>
           <w:szCs w:val="34"/>
         </w:rPr>
@@ -2025,7 +2065,7 @@
       </w:r>
       <w:r>
         <w:rPr>
-          <w:rFonts w:ascii="Calibri" w:hAnsi="Calibri" w:cs="Calibri"/>
+          <w:rFonts w:ascii="Carlito" w:hAnsi="Carlito" w:cs="Carlito"/>
           <w:b/>
           <w:bCs/>
           <w:sz w:val="34"/>
@@ -2039,14 +2079,14 @@
         <w:spacing w:line="240" w:lineRule="auto"/>
         <w:jc w:val="both"/>
         <w:rPr>
-          <w:rFonts w:ascii="Calibri" w:hAnsi="Calibri" w:cs="Calibri"/>
-          <w:sz w:val="34"/>
-          <w:szCs w:val="34"/>
-        </w:rPr>
-      </w:pPr>
-      <w:r>
-        <w:rPr>
-          <w:rFonts w:ascii="Calibri" w:hAnsi="Calibri" w:cs="Calibri"/>
+          <w:rFonts w:ascii="Carlito" w:hAnsi="Carlito" w:cs="Carlito"/>
+          <w:sz w:val="34"/>
+          <w:szCs w:val="34"/>
+        </w:rPr>
+      </w:pPr>
+      <w:r>
+        <w:rPr>
+          <w:rFonts w:ascii="Carlito" w:hAnsi="Carlito" w:cs="Carlito"/>
           <w:sz w:val="34"/>
           <w:szCs w:val="34"/>
         </w:rPr>
@@ -2058,17 +2098,17 @@
         <w:spacing w:line="240" w:lineRule="auto"/>
         <w:jc w:val="both"/>
         <w:rPr>
-          <w:rFonts w:ascii="Calibri" w:hAnsi="Calibri" w:cs="Calibri"/>
-          <w:b/>
-          <w:bCs/>
-          <w:color w:val="D86DCB" w:themeColor="accent5" w:themeTint="99"/>
-          <w:sz w:val="34"/>
-          <w:szCs w:val="34"/>
-        </w:rPr>
-      </w:pPr>
-      <w:r>
-        <w:rPr>
-          <w:rFonts w:ascii="Calibri" w:hAnsi="Calibri" w:cs="Calibri"/>
+          <w:rFonts w:ascii="Carlito" w:hAnsi="Carlito" w:cs="Carlito"/>
+          <w:b/>
+          <w:bCs/>
+          <w:color w:val="D86DCB" w:themeColor="accent5" w:themeTint="99"/>
+          <w:sz w:val="34"/>
+          <w:szCs w:val="34"/>
+        </w:rPr>
+      </w:pPr>
+      <w:r>
+        <w:rPr>
+          <w:rFonts w:ascii="Carlito" w:hAnsi="Carlito" w:cs="Carlito"/>
           <w:b/>
           <w:bCs/>
           <w:color w:val="D86DCB" w:themeColor="accent5" w:themeTint="99"/>
@@ -2083,14 +2123,14 @@
         <w:spacing w:line="240" w:lineRule="auto"/>
         <w:jc w:val="both"/>
         <w:rPr>
-          <w:rFonts w:ascii="Calibri" w:hAnsi="Calibri" w:cs="Calibri"/>
-          <w:sz w:val="34"/>
-          <w:szCs w:val="34"/>
-        </w:rPr>
-      </w:pPr>
-      <w:r>
-        <w:rPr>
-          <w:rFonts w:ascii="Calibri" w:hAnsi="Calibri" w:cs="Calibri"/>
+          <w:rFonts w:ascii="Carlito" w:hAnsi="Carlito" w:cs="Carlito"/>
+          <w:sz w:val="34"/>
+          <w:szCs w:val="34"/>
+        </w:rPr>
+      </w:pPr>
+      <w:r>
+        <w:rPr>
+          <w:rFonts w:ascii="Carlito" w:hAnsi="Carlito" w:cs="Carlito"/>
           <w:sz w:val="34"/>
           <w:szCs w:val="34"/>
         </w:rPr>
@@ -2098,7 +2138,7 @@
       </w:r>
       <w:r>
         <w:rPr>
-          <w:rFonts w:ascii="Calibri" w:hAnsi="Calibri" w:cs="Calibri"/>
+          <w:rFonts w:ascii="Carlito" w:hAnsi="Carlito" w:cs="Carlito"/>
           <w:b/>
           <w:bCs/>
           <w:sz w:val="34"/>
@@ -2108,7 +2148,7 @@
       </w:r>
       <w:r>
         <w:rPr>
-          <w:rFonts w:ascii="Calibri" w:hAnsi="Calibri" w:cs="Calibri"/>
+          <w:rFonts w:ascii="Carlito" w:hAnsi="Carlito" w:cs="Carlito"/>
           <w:sz w:val="34"/>
           <w:szCs w:val="34"/>
         </w:rPr>
@@ -2116,7 +2156,7 @@
       </w:r>
       <w:r>
         <w:rPr>
-          <w:rFonts w:ascii="Calibri" w:hAnsi="Calibri" w:cs="Calibri"/>
+          <w:rFonts w:ascii="Carlito" w:hAnsi="Carlito" w:cs="Carlito"/>
           <w:b/>
           <w:bCs/>
           <w:sz w:val="34"/>
@@ -2126,7 +2166,7 @@
       </w:r>
       <w:r>
         <w:rPr>
-          <w:rFonts w:ascii="Calibri" w:hAnsi="Calibri" w:cs="Calibri"/>
+          <w:rFonts w:ascii="Carlito" w:hAnsi="Carlito" w:cs="Carlito"/>
           <w:sz w:val="34"/>
           <w:szCs w:val="34"/>
         </w:rPr>
@@ -2134,7 +2174,7 @@
       </w:r>
       <w:r>
         <w:rPr>
-          <w:rFonts w:ascii="Calibri" w:hAnsi="Calibri" w:cs="Calibri"/>
+          <w:rFonts w:ascii="Carlito" w:hAnsi="Carlito" w:cs="Carlito"/>
           <w:b/>
           <w:bCs/>
           <w:sz w:val="34"/>
@@ -2144,7 +2184,7 @@
       </w:r>
       <w:r>
         <w:rPr>
-          <w:rFonts w:ascii="Calibri" w:hAnsi="Calibri" w:cs="Calibri"/>
+          <w:rFonts w:ascii="Carlito" w:hAnsi="Carlito" w:cs="Carlito"/>
           <w:sz w:val="34"/>
           <w:szCs w:val="34"/>
         </w:rPr>
@@ -2156,14 +2196,14 @@
         <w:spacing w:line="240" w:lineRule="auto"/>
         <w:jc w:val="both"/>
         <w:rPr>
-          <w:rFonts w:ascii="Calibri" w:hAnsi="Calibri" w:cs="Calibri"/>
-          <w:sz w:val="34"/>
-          <w:szCs w:val="34"/>
-        </w:rPr>
-      </w:pPr>
-      <w:r>
-        <w:rPr>
-          <w:rFonts w:ascii="Calibri" w:hAnsi="Calibri" w:cs="Calibri"/>
+          <w:rFonts w:ascii="Carlito" w:hAnsi="Carlito" w:cs="Carlito"/>
+          <w:sz w:val="34"/>
+          <w:szCs w:val="34"/>
+        </w:rPr>
+      </w:pPr>
+      <w:r>
+        <w:rPr>
+          <w:rFonts w:ascii="Carlito" w:hAnsi="Carlito" w:cs="Carlito"/>
           <w:sz w:val="34"/>
           <w:szCs w:val="34"/>
         </w:rPr>
@@ -2171,7 +2211,7 @@
       </w:r>
       <w:r>
         <w:rPr>
-          <w:rFonts w:ascii="Calibri" w:hAnsi="Calibri" w:cs="Calibri"/>
+          <w:rFonts w:ascii="Carlito" w:hAnsi="Carlito" w:cs="Carlito"/>
           <w:b/>
           <w:bCs/>
           <w:sz w:val="34"/>
@@ -2181,7 +2221,7 @@
       </w:r>
       <w:r>
         <w:rPr>
-          <w:rFonts w:ascii="Calibri" w:hAnsi="Calibri" w:cs="Calibri"/>
+          <w:rFonts w:ascii="Carlito" w:hAnsi="Carlito" w:cs="Carlito"/>
           <w:sz w:val="34"/>
           <w:szCs w:val="34"/>
         </w:rPr>
@@ -2193,17 +2233,17 @@
         <w:spacing w:line="240" w:lineRule="auto"/>
         <w:jc w:val="both"/>
         <w:rPr>
-          <w:rFonts w:ascii="Calibri" w:hAnsi="Calibri" w:cs="Calibri"/>
-          <w:b/>
-          <w:bCs/>
-          <w:color w:val="D86DCB" w:themeColor="accent5" w:themeTint="99"/>
-          <w:sz w:val="34"/>
-          <w:szCs w:val="34"/>
-        </w:rPr>
-      </w:pPr>
-      <w:r>
-        <w:rPr>
-          <w:rFonts w:ascii="Calibri" w:hAnsi="Calibri" w:cs="Calibri"/>
+          <w:rFonts w:ascii="Carlito" w:hAnsi="Carlito" w:cs="Carlito"/>
+          <w:b/>
+          <w:bCs/>
+          <w:color w:val="D86DCB" w:themeColor="accent5" w:themeTint="99"/>
+          <w:sz w:val="34"/>
+          <w:szCs w:val="34"/>
+        </w:rPr>
+      </w:pPr>
+      <w:r>
+        <w:rPr>
+          <w:rFonts w:ascii="Carlito" w:hAnsi="Carlito" w:cs="Carlito"/>
           <w:b/>
           <w:bCs/>
           <w:color w:val="D86DCB" w:themeColor="accent5" w:themeTint="99"/>
@@ -2218,17 +2258,17 @@
         <w:spacing w:line="240" w:lineRule="auto"/>
         <w:jc w:val="both"/>
         <w:rPr>
-          <w:rFonts w:ascii="Calibri" w:hAnsi="Calibri" w:cs="Calibri"/>
-          <w:b/>
-          <w:bCs/>
-          <w:color w:val="D86DCB" w:themeColor="accent5" w:themeTint="99"/>
-          <w:sz w:val="34"/>
-          <w:szCs w:val="34"/>
-        </w:rPr>
-      </w:pPr>
-      <w:r>
-        <w:rPr>
-          <w:rFonts w:ascii="Calibri" w:hAnsi="Calibri" w:cs="Calibri"/>
+          <w:rFonts w:ascii="Carlito" w:hAnsi="Carlito" w:cs="Carlito"/>
+          <w:b/>
+          <w:bCs/>
+          <w:color w:val="D86DCB" w:themeColor="accent5" w:themeTint="99"/>
+          <w:sz w:val="34"/>
+          <w:szCs w:val="34"/>
+        </w:rPr>
+      </w:pPr>
+      <w:r>
+        <w:rPr>
+          <w:rFonts w:ascii="Carlito" w:hAnsi="Carlito" w:cs="Carlito"/>
           <w:b/>
           <w:bCs/>
           <w:color w:val="D86DCB" w:themeColor="accent5" w:themeTint="99"/>
@@ -2243,17 +2283,17 @@
         <w:spacing w:line="240" w:lineRule="auto"/>
         <w:jc w:val="both"/>
         <w:rPr>
-          <w:rFonts w:ascii="Calibri" w:hAnsi="Calibri" w:cs="Calibri"/>
-          <w:b/>
-          <w:bCs/>
-          <w:color w:val="D86DCB" w:themeColor="accent5" w:themeTint="99"/>
-          <w:sz w:val="34"/>
-          <w:szCs w:val="34"/>
-        </w:rPr>
-      </w:pPr>
-      <w:r>
-        <w:rPr>
-          <w:rFonts w:ascii="Calibri" w:hAnsi="Calibri" w:cs="Calibri"/>
+          <w:rFonts w:ascii="Carlito" w:hAnsi="Carlito" w:cs="Carlito"/>
+          <w:b/>
+          <w:bCs/>
+          <w:color w:val="D86DCB" w:themeColor="accent5" w:themeTint="99"/>
+          <w:sz w:val="34"/>
+          <w:szCs w:val="34"/>
+        </w:rPr>
+      </w:pPr>
+      <w:r>
+        <w:rPr>
+          <w:rFonts w:ascii="Carlito" w:hAnsi="Carlito" w:cs="Carlito"/>
           <w:b/>
           <w:bCs/>
           <w:color w:val="D86DCB" w:themeColor="accent5" w:themeTint="99"/>
@@ -2268,17 +2308,17 @@
         <w:spacing w:line="240" w:lineRule="auto"/>
         <w:jc w:val="both"/>
         <w:rPr>
-          <w:rFonts w:ascii="Calibri" w:hAnsi="Calibri" w:cs="Calibri"/>
-          <w:b/>
-          <w:bCs/>
-          <w:color w:val="D86DCB" w:themeColor="accent5" w:themeTint="99"/>
-          <w:sz w:val="34"/>
-          <w:szCs w:val="34"/>
-        </w:rPr>
-      </w:pPr>
-      <w:r>
-        <w:rPr>
-          <w:rFonts w:ascii="Calibri" w:hAnsi="Calibri" w:cs="Calibri"/>
+          <w:rFonts w:ascii="Carlito" w:hAnsi="Carlito" w:cs="Carlito"/>
+          <w:b/>
+          <w:bCs/>
+          <w:color w:val="D86DCB" w:themeColor="accent5" w:themeTint="99"/>
+          <w:sz w:val="34"/>
+          <w:szCs w:val="34"/>
+        </w:rPr>
+      </w:pPr>
+      <w:r>
+        <w:rPr>
+          <w:rFonts w:ascii="Carlito" w:hAnsi="Carlito" w:cs="Carlito"/>
           <w:b/>
           <w:bCs/>
           <w:color w:val="D86DCB" w:themeColor="accent5" w:themeTint="99"/>
@@ -2293,18 +2333,18 @@
         <w:spacing w:line="240" w:lineRule="auto"/>
         <w:jc w:val="both"/>
         <w:rPr>
-          <w:rFonts w:ascii="Calibri" w:hAnsi="Calibri" w:cs="Calibri"/>
-          <w:sz w:val="34"/>
-          <w:szCs w:val="34"/>
-        </w:rPr>
-      </w:pPr>
-    </w:p>
-    <w:p>
-      <w:pPr>
-        <w:spacing w:line="240" w:lineRule="auto"/>
-        <w:jc w:val="both"/>
-        <w:rPr>
-          <w:rFonts w:ascii="Calibri" w:hAnsi="Calibri" w:cs="Calibri"/>
+          <w:rFonts w:ascii="Carlito" w:hAnsi="Carlito" w:cs="Carlito"/>
+          <w:sz w:val="34"/>
+          <w:szCs w:val="34"/>
+        </w:rPr>
+      </w:pPr>
+    </w:p>
+    <w:p>
+      <w:pPr>
+        <w:spacing w:line="240" w:lineRule="auto"/>
+        <w:jc w:val="both"/>
+        <w:rPr>
+          <w:rFonts w:ascii="Carlito" w:hAnsi="Carlito" w:cs="Carlito"/>
           <w:sz w:val="34"/>
           <w:szCs w:val="34"/>
         </w:rPr>
@@ -2315,14 +2355,14 @@
         <w:spacing w:line="240" w:lineRule="auto"/>
         <w:jc w:val="center"/>
         <w:rPr>
-          <w:rFonts w:ascii="Calibri" w:hAnsi="Calibri" w:cs="Calibri"/>
-          <w:sz w:val="34"/>
-          <w:szCs w:val="34"/>
-        </w:rPr>
-      </w:pPr>
-      <w:r>
-        <w:rPr>
-          <w:rFonts w:ascii="Calibri" w:hAnsi="Calibri" w:cs="Calibri"/>
+          <w:rFonts w:ascii="Carlito" w:hAnsi="Carlito" w:cs="Carlito"/>
+          <w:sz w:val="34"/>
+          <w:szCs w:val="34"/>
+        </w:rPr>
+      </w:pPr>
+      <w:r>
+        <w:rPr>
+          <w:rFonts w:ascii="Carlito" w:hAnsi="Carlito" w:cs="Carlito"/>
           <w:sz w:val="34"/>
           <w:szCs w:val="34"/>
         </w:rPr>
@@ -2334,27 +2374,27 @@
         <w:spacing w:line="240" w:lineRule="auto"/>
         <w:jc w:val="both"/>
         <w:rPr>
-          <w:rFonts w:ascii="Calibri" w:hAnsi="Calibri" w:cs="Calibri"/>
-          <w:sz w:val="34"/>
-          <w:szCs w:val="34"/>
-        </w:rPr>
-      </w:pPr>
-    </w:p>
-    <w:p>
-      <w:pPr>
-        <w:spacing w:line="240" w:lineRule="auto"/>
-        <w:jc w:val="both"/>
-        <w:rPr>
-          <w:rFonts w:ascii="Calibri" w:hAnsi="Calibri" w:cs="Calibri"/>
-          <w:b/>
-          <w:bCs/>
-          <w:sz w:val="34"/>
-          <w:szCs w:val="34"/>
-        </w:rPr>
-      </w:pPr>
-      <w:r>
-        <w:rPr>
-          <w:rFonts w:ascii="Calibri" w:hAnsi="Calibri" w:cs="Calibri"/>
+          <w:rFonts w:ascii="Carlito" w:hAnsi="Carlito" w:cs="Carlito"/>
+          <w:sz w:val="34"/>
+          <w:szCs w:val="34"/>
+        </w:rPr>
+      </w:pPr>
+    </w:p>
+    <w:p>
+      <w:pPr>
+        <w:spacing w:line="240" w:lineRule="auto"/>
+        <w:jc w:val="both"/>
+        <w:rPr>
+          <w:rFonts w:ascii="Carlito" w:hAnsi="Carlito" w:cs="Carlito"/>
+          <w:b/>
+          <w:bCs/>
+          <w:sz w:val="34"/>
+          <w:szCs w:val="34"/>
+        </w:rPr>
+      </w:pPr>
+      <w:r>
+        <w:rPr>
+          <w:rFonts w:ascii="Carlito" w:hAnsi="Carlito" w:cs="Carlito"/>
           <w:b/>
           <w:bCs/>
           <w:sz w:val="34"/>
@@ -2364,7 +2404,7 @@
       </w:r>
       <w:r>
         <w:rPr>
-          <w:rFonts w:ascii="Calibri" w:hAnsi="Calibri" w:cs="Calibri"/>
+          <w:rFonts w:ascii="Carlito" w:hAnsi="Carlito" w:cs="Carlito"/>
           <w:b/>
           <w:bCs/>
           <w:sz w:val="34"/>
@@ -2374,7 +2414,7 @@
       </w:r>
       <w:r>
         <w:rPr>
-          <w:rFonts w:ascii="Calibri" w:hAnsi="Calibri" w:cs="Calibri"/>
+          <w:rFonts w:ascii="Carlito" w:hAnsi="Carlito" w:cs="Carlito"/>
           <w:b/>
           <w:bCs/>
           <w:sz w:val="34"/>
@@ -2388,14 +2428,14 @@
         <w:spacing w:line="240" w:lineRule="auto"/>
         <w:jc w:val="both"/>
         <w:rPr>
-          <w:rFonts w:ascii="Calibri" w:hAnsi="Calibri" w:cs="Calibri"/>
-          <w:sz w:val="34"/>
-          <w:szCs w:val="34"/>
-        </w:rPr>
-      </w:pPr>
-      <w:r>
-        <w:rPr>
-          <w:rFonts w:ascii="Calibri" w:hAnsi="Calibri" w:cs="Calibri"/>
+          <w:rFonts w:ascii="Carlito" w:hAnsi="Carlito" w:cs="Carlito"/>
+          <w:sz w:val="34"/>
+          <w:szCs w:val="34"/>
+        </w:rPr>
+      </w:pPr>
+      <w:r>
+        <w:rPr>
+          <w:rFonts w:ascii="Carlito" w:hAnsi="Carlito" w:cs="Carlito"/>
           <w:sz w:val="34"/>
           <w:szCs w:val="34"/>
         </w:rPr>
@@ -2403,7 +2443,7 @@
       </w:r>
       <w:r>
         <w:rPr>
-          <w:rFonts w:ascii="Calibri" w:hAnsi="Calibri" w:cs="Calibri"/>
+          <w:rFonts w:ascii="Carlito" w:hAnsi="Carlito" w:cs="Carlito"/>
           <w:sz w:val="34"/>
           <w:szCs w:val="34"/>
         </w:rPr>
@@ -2411,7 +2451,7 @@
       </w:r>
       <w:r>
         <w:rPr>
-          <w:rFonts w:ascii="Calibri" w:hAnsi="Calibri" w:cs="Calibri"/>
+          <w:rFonts w:ascii="Carlito" w:hAnsi="Carlito" w:cs="Carlito"/>
           <w:b/>
           <w:bCs/>
           <w:sz w:val="34"/>
@@ -2421,7 +2461,7 @@
       </w:r>
       <w:r>
         <w:rPr>
-          <w:rFonts w:ascii="Calibri" w:hAnsi="Calibri" w:cs="Calibri"/>
+          <w:rFonts w:ascii="Carlito" w:hAnsi="Carlito" w:cs="Carlito"/>
           <w:sz w:val="34"/>
           <w:szCs w:val="34"/>
         </w:rPr>
@@ -2433,14 +2473,14 @@
         <w:spacing w:line="240" w:lineRule="auto"/>
         <w:jc w:val="both"/>
         <w:rPr>
-          <w:rFonts w:ascii="Calibri" w:hAnsi="Calibri" w:cs="Calibri"/>
-          <w:sz w:val="34"/>
-          <w:szCs w:val="34"/>
-        </w:rPr>
-      </w:pPr>
-      <w:r>
-        <w:rPr>
-          <w:rFonts w:ascii="Calibri" w:hAnsi="Calibri" w:cs="Calibri"/>
+          <w:rFonts w:ascii="Carlito" w:hAnsi="Carlito" w:cs="Carlito"/>
+          <w:sz w:val="34"/>
+          <w:szCs w:val="34"/>
+        </w:rPr>
+      </w:pPr>
+      <w:r>
+        <w:rPr>
+          <w:rFonts w:ascii="Carlito" w:hAnsi="Carlito" w:cs="Carlito"/>
           <w:sz w:val="34"/>
           <w:szCs w:val="34"/>
         </w:rPr>
@@ -2448,7 +2488,7 @@
       </w:r>
       <w:r>
         <w:rPr>
-          <w:rFonts w:ascii="Calibri" w:hAnsi="Calibri" w:cs="Calibri"/>
+          <w:rFonts w:ascii="Carlito" w:hAnsi="Carlito" w:cs="Carlito"/>
           <w:b/>
           <w:bCs/>
           <w:sz w:val="34"/>
@@ -2458,7 +2498,7 @@
       </w:r>
       <w:r>
         <w:rPr>
-          <w:rFonts w:ascii="Calibri" w:hAnsi="Calibri" w:cs="Calibri"/>
+          <w:rFonts w:ascii="Carlito" w:hAnsi="Carlito" w:cs="Carlito"/>
           <w:sz w:val="34"/>
           <w:szCs w:val="34"/>
         </w:rPr>
@@ -2470,14 +2510,14 @@
         <w:spacing w:line="240" w:lineRule="auto"/>
         <w:jc w:val="both"/>
         <w:rPr>
-          <w:rFonts w:ascii="Calibri" w:hAnsi="Calibri" w:cs="Calibri"/>
-          <w:sz w:val="34"/>
-          <w:szCs w:val="34"/>
-        </w:rPr>
-      </w:pPr>
-      <w:r>
-        <w:rPr>
-          <w:rFonts w:ascii="Calibri" w:hAnsi="Calibri" w:cs="Calibri"/>
+          <w:rFonts w:ascii="Carlito" w:hAnsi="Carlito" w:cs="Carlito"/>
+          <w:sz w:val="34"/>
+          <w:szCs w:val="34"/>
+        </w:rPr>
+      </w:pPr>
+      <w:r>
+        <w:rPr>
+          <w:rFonts w:ascii="Carlito" w:hAnsi="Carlito" w:cs="Carlito"/>
           <w:sz w:val="34"/>
           <w:szCs w:val="34"/>
         </w:rPr>
@@ -2494,14 +2534,14 @@
         <w:spacing w:line="240" w:lineRule="auto"/>
         <w:jc w:val="both"/>
         <w:rPr>
-          <w:rFonts w:ascii="Calibri" w:hAnsi="Calibri" w:cs="Calibri"/>
-          <w:sz w:val="34"/>
-          <w:szCs w:val="34"/>
-        </w:rPr>
-      </w:pPr>
-      <w:r>
-        <w:rPr>
-          <w:rFonts w:ascii="Calibri" w:hAnsi="Calibri" w:cs="Calibri"/>
+          <w:rFonts w:ascii="Carlito" w:hAnsi="Carlito" w:cs="Carlito"/>
+          <w:sz w:val="34"/>
+          <w:szCs w:val="34"/>
+        </w:rPr>
+      </w:pPr>
+      <w:r>
+        <w:rPr>
+          <w:rFonts w:ascii="Carlito" w:hAnsi="Carlito" w:cs="Carlito"/>
           <w:b/>
           <w:bCs/>
           <w:sz w:val="34"/>
@@ -2511,7 +2551,7 @@
       </w:r>
       <w:r>
         <w:rPr>
-          <w:rFonts w:ascii="Calibri" w:hAnsi="Calibri" w:cs="Calibri"/>
+          <w:rFonts w:ascii="Carlito" w:hAnsi="Carlito" w:cs="Carlito"/>
           <w:sz w:val="34"/>
           <w:szCs w:val="34"/>
         </w:rPr>
@@ -2528,14 +2568,14 @@
         <w:spacing w:line="240" w:lineRule="auto"/>
         <w:jc w:val="both"/>
         <w:rPr>
-          <w:rFonts w:ascii="Calibri" w:hAnsi="Calibri" w:cs="Calibri"/>
-          <w:sz w:val="34"/>
-          <w:szCs w:val="34"/>
-        </w:rPr>
-      </w:pPr>
-      <w:r>
-        <w:rPr>
-          <w:rFonts w:ascii="Calibri" w:hAnsi="Calibri" w:cs="Calibri"/>
+          <w:rFonts w:ascii="Carlito" w:hAnsi="Carlito" w:cs="Carlito"/>
+          <w:sz w:val="34"/>
+          <w:szCs w:val="34"/>
+        </w:rPr>
+      </w:pPr>
+      <w:r>
+        <w:rPr>
+          <w:rFonts w:ascii="Carlito" w:hAnsi="Carlito" w:cs="Carlito"/>
           <w:b/>
           <w:bCs/>
           <w:sz w:val="34"/>
@@ -2546,7 +2586,7 @@
       </w:r>
       <w:r>
         <w:rPr>
-          <w:rFonts w:ascii="Calibri" w:hAnsi="Calibri" w:cs="Calibri"/>
+          <w:rFonts w:ascii="Carlito" w:hAnsi="Carlito" w:cs="Carlito"/>
           <w:sz w:val="34"/>
           <w:szCs w:val="34"/>
         </w:rPr>
@@ -2563,14 +2603,14 @@
         <w:spacing w:line="240" w:lineRule="auto"/>
         <w:jc w:val="both"/>
         <w:rPr>
-          <w:rFonts w:ascii="Calibri" w:hAnsi="Calibri" w:cs="Calibri"/>
-          <w:sz w:val="34"/>
-          <w:szCs w:val="34"/>
-        </w:rPr>
-      </w:pPr>
-      <w:r>
-        <w:rPr>
-          <w:rFonts w:ascii="Calibri" w:hAnsi="Calibri" w:cs="Calibri"/>
+          <w:rFonts w:ascii="Carlito" w:hAnsi="Carlito" w:cs="Carlito"/>
+          <w:sz w:val="34"/>
+          <w:szCs w:val="34"/>
+        </w:rPr>
+      </w:pPr>
+      <w:r>
+        <w:rPr>
+          <w:rFonts w:ascii="Carlito" w:hAnsi="Carlito" w:cs="Carlito"/>
           <w:b/>
           <w:bCs/>
           <w:sz w:val="34"/>
@@ -2580,7 +2620,7 @@
       </w:r>
       <w:r>
         <w:rPr>
-          <w:rFonts w:ascii="Calibri" w:hAnsi="Calibri" w:cs="Calibri"/>
+          <w:rFonts w:ascii="Carlito" w:hAnsi="Carlito" w:cs="Carlito"/>
           <w:sz w:val="34"/>
           <w:szCs w:val="34"/>
         </w:rPr>
@@ -2592,16 +2632,16 @@
         <w:spacing w:line="240" w:lineRule="auto"/>
         <w:jc w:val="both"/>
         <w:rPr>
-          <w:rFonts w:ascii="Calibri" w:hAnsi="Calibri" w:cs="Calibri"/>
-          <w:b/>
-          <w:bCs/>
-          <w:sz w:val="34"/>
-          <w:szCs w:val="34"/>
-        </w:rPr>
-      </w:pPr>
-      <w:r>
-        <w:rPr>
-          <w:rFonts w:ascii="Calibri" w:hAnsi="Calibri" w:cs="Calibri"/>
+          <w:rFonts w:ascii="Carlito" w:hAnsi="Carlito" w:cs="Carlito"/>
+          <w:b/>
+          <w:bCs/>
+          <w:sz w:val="34"/>
+          <w:szCs w:val="34"/>
+        </w:rPr>
+      </w:pPr>
+      <w:r>
+        <w:rPr>
+          <w:rFonts w:ascii="Carlito" w:hAnsi="Carlito" w:cs="Carlito"/>
           <w:b/>
           <w:bCs/>
           <w:sz w:val="34"/>
@@ -2615,14 +2655,14 @@
         <w:spacing w:line="240" w:lineRule="auto"/>
         <w:jc w:val="both"/>
         <w:rPr>
-          <w:rFonts w:ascii="Calibri" w:hAnsi="Calibri" w:cs="Calibri"/>
-          <w:sz w:val="34"/>
-          <w:szCs w:val="34"/>
-        </w:rPr>
-      </w:pPr>
-      <w:r>
-        <w:rPr>
-          <w:rFonts w:ascii="Calibri" w:hAnsi="Calibri" w:cs="Calibri"/>
+          <w:rFonts w:ascii="Carlito" w:hAnsi="Carlito" w:cs="Carlito"/>
+          <w:sz w:val="34"/>
+          <w:szCs w:val="34"/>
+        </w:rPr>
+      </w:pPr>
+      <w:r>
+        <w:rPr>
+          <w:rFonts w:ascii="Carlito" w:hAnsi="Carlito" w:cs="Carlito"/>
           <w:sz w:val="34"/>
           <w:szCs w:val="34"/>
         </w:rPr>
@@ -2630,7 +2670,7 @@
       </w:r>
       <w:r>
         <w:rPr>
-          <w:rFonts w:ascii="Calibri" w:hAnsi="Calibri" w:cs="Calibri"/>
+          <w:rFonts w:ascii="Carlito" w:hAnsi="Carlito" w:cs="Carlito"/>
           <w:b/>
           <w:bCs/>
           <w:sz w:val="34"/>
@@ -2640,7 +2680,7 @@
       </w:r>
       <w:r>
         <w:rPr>
-          <w:rFonts w:ascii="Calibri" w:hAnsi="Calibri" w:cs="Calibri"/>
+          <w:rFonts w:ascii="Carlito" w:hAnsi="Carlito" w:cs="Carlito"/>
           <w:sz w:val="34"/>
           <w:szCs w:val="34"/>
         </w:rPr>
@@ -2652,14 +2692,14 @@
         <w:spacing w:line="240" w:lineRule="auto"/>
         <w:jc w:val="both"/>
         <w:rPr>
-          <w:rFonts w:ascii="Calibri" w:hAnsi="Calibri" w:cs="Calibri"/>
-          <w:sz w:val="34"/>
-          <w:szCs w:val="34"/>
-        </w:rPr>
-      </w:pPr>
-      <w:r>
-        <w:rPr>
-          <w:rFonts w:ascii="Calibri" w:hAnsi="Calibri" w:cs="Calibri"/>
+          <w:rFonts w:ascii="Carlito" w:hAnsi="Carlito" w:cs="Carlito"/>
+          <w:sz w:val="34"/>
+          <w:szCs w:val="34"/>
+        </w:rPr>
+      </w:pPr>
+      <w:r>
+        <w:rPr>
+          <w:rFonts w:ascii="Carlito" w:hAnsi="Carlito" w:cs="Carlito"/>
           <w:sz w:val="34"/>
           <w:szCs w:val="34"/>
         </w:rPr>
@@ -2667,7 +2707,7 @@
       </w:r>
       <w:r>
         <w:rPr>
-          <w:rFonts w:ascii="Calibri" w:hAnsi="Calibri" w:cs="Calibri"/>
+          <w:rFonts w:ascii="Carlito" w:hAnsi="Carlito" w:cs="Carlito"/>
           <w:b/>
           <w:bCs/>
           <w:sz w:val="34"/>
@@ -2681,17 +2721,17 @@
         <w:spacing w:line="240" w:lineRule="auto"/>
         <w:jc w:val="both"/>
         <w:rPr>
-          <w:rFonts w:ascii="Calibri" w:hAnsi="Calibri" w:cs="Calibri"/>
-          <w:b/>
-          <w:bCs/>
-          <w:color w:val="D86DCB" w:themeColor="accent5" w:themeTint="99"/>
-          <w:sz w:val="34"/>
-          <w:szCs w:val="34"/>
-        </w:rPr>
-      </w:pPr>
-      <w:r>
-        <w:rPr>
-          <w:rFonts w:ascii="Calibri" w:hAnsi="Calibri" w:cs="Calibri"/>
+          <w:rFonts w:ascii="Carlito" w:hAnsi="Carlito" w:cs="Carlito"/>
+          <w:b/>
+          <w:bCs/>
+          <w:color w:val="D86DCB" w:themeColor="accent5" w:themeTint="99"/>
+          <w:sz w:val="34"/>
+          <w:szCs w:val="34"/>
+        </w:rPr>
+      </w:pPr>
+      <w:r>
+        <w:rPr>
+          <w:rFonts w:ascii="Carlito" w:hAnsi="Carlito" w:cs="Carlito"/>
           <w:b/>
           <w:bCs/>
           <w:color w:val="D86DCB" w:themeColor="accent5" w:themeTint="99"/>
@@ -2706,17 +2746,17 @@
         <w:spacing w:line="240" w:lineRule="auto"/>
         <w:jc w:val="both"/>
         <w:rPr>
-          <w:rFonts w:ascii="Calibri" w:hAnsi="Calibri" w:cs="Calibri"/>
-          <w:b/>
-          <w:bCs/>
-          <w:color w:val="D86DCB" w:themeColor="accent5" w:themeTint="99"/>
-          <w:sz w:val="34"/>
-          <w:szCs w:val="34"/>
-        </w:rPr>
-      </w:pPr>
-      <w:r>
-        <w:rPr>
-          <w:rFonts w:ascii="Calibri" w:hAnsi="Calibri" w:cs="Calibri"/>
+          <w:rFonts w:ascii="Carlito" w:hAnsi="Carlito" w:cs="Carlito"/>
+          <w:b/>
+          <w:bCs/>
+          <w:color w:val="D86DCB" w:themeColor="accent5" w:themeTint="99"/>
+          <w:sz w:val="34"/>
+          <w:szCs w:val="34"/>
+        </w:rPr>
+      </w:pPr>
+      <w:r>
+        <w:rPr>
+          <w:rFonts w:ascii="Carlito" w:hAnsi="Carlito" w:cs="Carlito"/>
           <w:b/>
           <w:bCs/>
           <w:color w:val="D86DCB" w:themeColor="accent5" w:themeTint="99"/>
@@ -2731,17 +2771,17 @@
         <w:spacing w:line="240" w:lineRule="auto"/>
         <w:jc w:val="both"/>
         <w:rPr>
-          <w:rFonts w:ascii="Calibri" w:hAnsi="Calibri" w:cs="Calibri"/>
-          <w:b/>
-          <w:bCs/>
-          <w:color w:val="D86DCB" w:themeColor="accent5" w:themeTint="99"/>
-          <w:sz w:val="34"/>
-          <w:szCs w:val="34"/>
-        </w:rPr>
-      </w:pPr>
-      <w:r>
-        <w:rPr>
-          <w:rFonts w:ascii="Calibri" w:hAnsi="Calibri" w:cs="Calibri"/>
+          <w:rFonts w:ascii="Carlito" w:hAnsi="Carlito" w:cs="Carlito"/>
+          <w:b/>
+          <w:bCs/>
+          <w:color w:val="D86DCB" w:themeColor="accent5" w:themeTint="99"/>
+          <w:sz w:val="34"/>
+          <w:szCs w:val="34"/>
+        </w:rPr>
+      </w:pPr>
+      <w:r>
+        <w:rPr>
+          <w:rFonts w:ascii="Carlito" w:hAnsi="Carlito" w:cs="Carlito"/>
           <w:b/>
           <w:bCs/>
           <w:color w:val="D86DCB" w:themeColor="accent5" w:themeTint="99"/>
@@ -2756,17 +2796,17 @@
         <w:spacing w:line="240" w:lineRule="auto"/>
         <w:jc w:val="both"/>
         <w:rPr>
-          <w:rFonts w:ascii="Calibri" w:hAnsi="Calibri" w:cs="Calibri"/>
-          <w:b/>
-          <w:bCs/>
-          <w:color w:val="D86DCB" w:themeColor="accent5" w:themeTint="99"/>
-          <w:sz w:val="34"/>
-          <w:szCs w:val="34"/>
-        </w:rPr>
-      </w:pPr>
-      <w:r>
-        <w:rPr>
-          <w:rFonts w:ascii="Calibri" w:hAnsi="Calibri" w:cs="Calibri"/>
+          <w:rFonts w:ascii="Carlito" w:hAnsi="Carlito" w:cs="Carlito"/>
+          <w:b/>
+          <w:bCs/>
+          <w:color w:val="D86DCB" w:themeColor="accent5" w:themeTint="99"/>
+          <w:sz w:val="34"/>
+          <w:szCs w:val="34"/>
+        </w:rPr>
+      </w:pPr>
+      <w:r>
+        <w:rPr>
+          <w:rFonts w:ascii="Carlito" w:hAnsi="Carlito" w:cs="Carlito"/>
           <w:b/>
           <w:bCs/>
           <w:color w:val="D86DCB" w:themeColor="accent5" w:themeTint="99"/>
@@ -2781,7 +2821,7 @@
         <w:spacing w:line="240" w:lineRule="auto"/>
         <w:jc w:val="both"/>
         <w:rPr>
-          <w:rFonts w:ascii="Calibri" w:hAnsi="Calibri" w:cs="Calibri"/>
+          <w:rFonts w:ascii="Carlito" w:hAnsi="Carlito" w:cs="Carlito"/>
           <w:sz w:val="34"/>
           <w:szCs w:val="34"/>
         </w:rPr>
@@ -2792,14 +2832,14 @@
         <w:spacing w:line="240" w:lineRule="auto"/>
         <w:jc w:val="center"/>
         <w:rPr>
-          <w:rFonts w:ascii="Calibri" w:hAnsi="Calibri" w:cs="Calibri"/>
-          <w:sz w:val="34"/>
-          <w:szCs w:val="34"/>
-        </w:rPr>
-      </w:pPr>
-      <w:r>
-        <w:rPr>
-          <w:rFonts w:ascii="Calibri" w:hAnsi="Calibri" w:cs="Calibri"/>
+          <w:rFonts w:ascii="Carlito" w:hAnsi="Carlito" w:cs="Carlito"/>
+          <w:sz w:val="34"/>
+          <w:szCs w:val="34"/>
+        </w:rPr>
+      </w:pPr>
+      <w:r>
+        <w:rPr>
+          <w:rFonts w:ascii="Carlito" w:hAnsi="Carlito" w:cs="Carlito"/>
           <w:sz w:val="34"/>
           <w:szCs w:val="34"/>
         </w:rPr>
@@ -2811,27 +2851,27 @@
         <w:spacing w:line="240" w:lineRule="auto"/>
         <w:jc w:val="both"/>
         <w:rPr>
-          <w:rFonts w:ascii="Calibri" w:hAnsi="Calibri" w:cs="Calibri"/>
-          <w:sz w:val="34"/>
-          <w:szCs w:val="34"/>
-        </w:rPr>
-      </w:pPr>
-    </w:p>
-    <w:p>
-      <w:pPr>
-        <w:spacing w:line="240" w:lineRule="auto"/>
-        <w:jc w:val="both"/>
-        <w:rPr>
-          <w:rFonts w:ascii="Calibri" w:hAnsi="Calibri" w:cs="Calibri"/>
-          <w:b/>
-          <w:bCs/>
-          <w:sz w:val="34"/>
-          <w:szCs w:val="34"/>
-        </w:rPr>
-      </w:pPr>
-      <w:r>
-        <w:rPr>
-          <w:rFonts w:ascii="Calibri" w:hAnsi="Calibri" w:cs="Calibri"/>
+          <w:rFonts w:ascii="Carlito" w:hAnsi="Carlito" w:cs="Carlito"/>
+          <w:sz w:val="34"/>
+          <w:szCs w:val="34"/>
+        </w:rPr>
+      </w:pPr>
+    </w:p>
+    <w:p>
+      <w:pPr>
+        <w:spacing w:line="240" w:lineRule="auto"/>
+        <w:jc w:val="both"/>
+        <w:rPr>
+          <w:rFonts w:ascii="Carlito" w:hAnsi="Carlito" w:cs="Carlito"/>
+          <w:b/>
+          <w:bCs/>
+          <w:sz w:val="34"/>
+          <w:szCs w:val="34"/>
+        </w:rPr>
+      </w:pPr>
+      <w:r>
+        <w:rPr>
+          <w:rFonts w:ascii="Carlito" w:hAnsi="Carlito" w:cs="Carlito"/>
           <w:b/>
           <w:bCs/>
           <w:sz w:val="34"/>
@@ -2841,7 +2881,7 @@
       </w:r>
       <w:r>
         <w:rPr>
-          <w:rFonts w:ascii="Calibri" w:hAnsi="Calibri" w:cs="Calibri"/>
+          <w:rFonts w:ascii="Carlito" w:hAnsi="Carlito" w:cs="Carlito"/>
           <w:b/>
           <w:bCs/>
           <w:sz w:val="34"/>
@@ -2851,7 +2891,7 @@
       </w:r>
       <w:r>
         <w:rPr>
-          <w:rFonts w:ascii="Calibri" w:hAnsi="Calibri" w:cs="Calibri"/>
+          <w:rFonts w:ascii="Carlito" w:hAnsi="Carlito" w:cs="Carlito"/>
           <w:b/>
           <w:bCs/>
           <w:sz w:val="34"/>
@@ -2861,7 +2901,7 @@
       </w:r>
       <w:r>
         <w:rPr>
-          <w:rFonts w:ascii="Calibri" w:hAnsi="Calibri" w:cs="Calibri"/>
+          <w:rFonts w:ascii="Carlito" w:hAnsi="Carlito" w:cs="Carlito"/>
           <w:b/>
           <w:bCs/>
           <w:sz w:val="34"/>
@@ -2875,14 +2915,14 @@
         <w:spacing w:line="240" w:lineRule="auto"/>
         <w:jc w:val="both"/>
         <w:rPr>
-          <w:rFonts w:ascii="Calibri" w:hAnsi="Calibri" w:cs="Calibri"/>
-          <w:sz w:val="34"/>
-          <w:szCs w:val="34"/>
-        </w:rPr>
-      </w:pPr>
-      <w:r>
-        <w:rPr>
-          <w:rFonts w:ascii="Calibri" w:hAnsi="Calibri" w:cs="Calibri"/>
+          <w:rFonts w:ascii="Carlito" w:hAnsi="Carlito" w:cs="Carlito"/>
+          <w:sz w:val="34"/>
+          <w:szCs w:val="34"/>
+        </w:rPr>
+      </w:pPr>
+      <w:r>
+        <w:rPr>
+          <w:rFonts w:ascii="Carlito" w:hAnsi="Carlito" w:cs="Carlito"/>
           <w:sz w:val="34"/>
           <w:szCs w:val="34"/>
         </w:rPr>
@@ -2894,14 +2934,14 @@
         <w:spacing w:line="240" w:lineRule="auto"/>
         <w:jc w:val="both"/>
         <w:rPr>
-          <w:rFonts w:ascii="Calibri" w:hAnsi="Calibri" w:cs="Calibri"/>
-          <w:sz w:val="34"/>
-          <w:szCs w:val="34"/>
-        </w:rPr>
-      </w:pPr>
-      <w:r>
-        <w:rPr>
-          <w:rFonts w:ascii="Calibri" w:hAnsi="Calibri" w:cs="Calibri"/>
+          <w:rFonts w:ascii="Carlito" w:hAnsi="Carlito" w:cs="Carlito"/>
+          <w:sz w:val="34"/>
+          <w:szCs w:val="34"/>
+        </w:rPr>
+      </w:pPr>
+      <w:r>
+        <w:rPr>
+          <w:rFonts w:ascii="Carlito" w:hAnsi="Carlito" w:cs="Carlito"/>
           <w:sz w:val="34"/>
           <w:szCs w:val="34"/>
         </w:rPr>
@@ -2909,7 +2949,7 @@
       </w:r>
       <w:r>
         <w:rPr>
-          <w:rFonts w:ascii="Calibri" w:hAnsi="Calibri" w:cs="Calibri"/>
+          <w:rFonts w:ascii="Carlito" w:hAnsi="Carlito" w:cs="Carlito"/>
           <w:b/>
           <w:bCs/>
           <w:sz w:val="34"/>
@@ -2919,7 +2959,7 @@
       </w:r>
       <w:r>
         <w:rPr>
-          <w:rFonts w:ascii="Calibri" w:hAnsi="Calibri" w:cs="Calibri"/>
+          <w:rFonts w:ascii="Carlito" w:hAnsi="Carlito" w:cs="Carlito"/>
           <w:sz w:val="34"/>
           <w:szCs w:val="34"/>
         </w:rPr>
@@ -2927,7 +2967,7 @@
       </w:r>
       <w:r>
         <w:rPr>
-          <w:rFonts w:ascii="Calibri" w:hAnsi="Calibri" w:cs="Calibri"/>
+          <w:rFonts w:ascii="Carlito" w:hAnsi="Carlito" w:cs="Carlito"/>
           <w:b/>
           <w:bCs/>
           <w:sz w:val="34"/>
@@ -2937,7 +2977,7 @@
       </w:r>
       <w:r>
         <w:rPr>
-          <w:rFonts w:ascii="Calibri" w:hAnsi="Calibri" w:cs="Calibri"/>
+          <w:rFonts w:ascii="Carlito" w:hAnsi="Carlito" w:cs="Carlito"/>
           <w:sz w:val="34"/>
           <w:szCs w:val="34"/>
         </w:rPr>
@@ -2949,16 +2989,16 @@
         <w:spacing w:line="240" w:lineRule="auto"/>
         <w:jc w:val="both"/>
         <w:rPr>
-          <w:rFonts w:ascii="Calibri" w:hAnsi="Calibri" w:cs="Calibri"/>
-          <w:b/>
-          <w:bCs/>
-          <w:sz w:val="34"/>
-          <w:szCs w:val="34"/>
-        </w:rPr>
-      </w:pPr>
-      <w:r>
-        <w:rPr>
-          <w:rFonts w:ascii="Calibri" w:hAnsi="Calibri" w:cs="Calibri"/>
+          <w:rFonts w:ascii="Carlito" w:hAnsi="Carlito" w:cs="Carlito"/>
+          <w:b/>
+          <w:bCs/>
+          <w:sz w:val="34"/>
+          <w:szCs w:val="34"/>
+        </w:rPr>
+      </w:pPr>
+      <w:r>
+        <w:rPr>
+          <w:rFonts w:ascii="Carlito" w:hAnsi="Carlito" w:cs="Carlito"/>
           <w:b/>
           <w:bCs/>
           <w:sz w:val="34"/>
@@ -2972,16 +3012,16 @@
         <w:spacing w:line="240" w:lineRule="auto"/>
         <w:jc w:val="both"/>
         <w:rPr>
-          <w:rFonts w:ascii="Calibri" w:hAnsi="Calibri" w:cs="Calibri"/>
-          <w:b/>
-          <w:bCs/>
-          <w:sz w:val="34"/>
-          <w:szCs w:val="34"/>
-        </w:rPr>
-      </w:pPr>
-      <w:r>
-        <w:rPr>
-          <w:rFonts w:ascii="Calibri" w:hAnsi="Calibri" w:cs="Calibri"/>
+          <w:rFonts w:ascii="Carlito" w:hAnsi="Carlito" w:cs="Carlito"/>
+          <w:b/>
+          <w:bCs/>
+          <w:sz w:val="34"/>
+          <w:szCs w:val="34"/>
+        </w:rPr>
+      </w:pPr>
+      <w:r>
+        <w:rPr>
+          <w:rFonts w:ascii="Carlito" w:hAnsi="Carlito" w:cs="Carlito"/>
           <w:b/>
           <w:bCs/>
           <w:sz w:val="34"/>
@@ -2995,14 +3035,14 @@
         <w:spacing w:line="240" w:lineRule="auto"/>
         <w:jc w:val="both"/>
         <w:rPr>
-          <w:rFonts w:ascii="Calibri" w:hAnsi="Calibri" w:cs="Calibri"/>
-          <w:sz w:val="34"/>
-          <w:szCs w:val="34"/>
-        </w:rPr>
-      </w:pPr>
-      <w:r>
-        <w:rPr>
-          <w:rFonts w:ascii="Calibri" w:hAnsi="Calibri" w:cs="Calibri"/>
+          <w:rFonts w:ascii="Carlito" w:hAnsi="Carlito" w:cs="Carlito"/>
+          <w:sz w:val="34"/>
+          <w:szCs w:val="34"/>
+        </w:rPr>
+      </w:pPr>
+      <w:r>
+        <w:rPr>
+          <w:rFonts w:ascii="Carlito" w:hAnsi="Carlito" w:cs="Carlito"/>
           <w:sz w:val="34"/>
           <w:szCs w:val="34"/>
         </w:rPr>
@@ -3014,14 +3054,14 @@
         <w:spacing w:line="240" w:lineRule="auto"/>
         <w:jc w:val="both"/>
         <w:rPr>
-          <w:rFonts w:ascii="Calibri" w:hAnsi="Calibri" w:cs="Calibri"/>
-          <w:sz w:val="34"/>
-          <w:szCs w:val="34"/>
-        </w:rPr>
-      </w:pPr>
-      <w:r>
-        <w:rPr>
-          <w:rFonts w:ascii="Calibri" w:hAnsi="Calibri" w:cs="Calibri"/>
+          <w:rFonts w:ascii="Carlito" w:hAnsi="Carlito" w:cs="Carlito"/>
+          <w:sz w:val="34"/>
+          <w:szCs w:val="34"/>
+        </w:rPr>
+      </w:pPr>
+      <w:r>
+        <w:rPr>
+          <w:rFonts w:ascii="Carlito" w:hAnsi="Carlito" w:cs="Carlito"/>
           <w:sz w:val="34"/>
           <w:szCs w:val="34"/>
         </w:rPr>
@@ -3029,7 +3069,7 @@
       </w:r>
       <w:r>
         <w:rPr>
-          <w:rFonts w:ascii="Calibri" w:hAnsi="Calibri" w:cs="Calibri"/>
+          <w:rFonts w:ascii="Carlito" w:hAnsi="Carlito" w:cs="Carlito"/>
           <w:b/>
           <w:bCs/>
           <w:sz w:val="34"/>
@@ -3039,7 +3079,7 @@
       </w:r>
       <w:r>
         <w:rPr>
-          <w:rFonts w:ascii="Calibri" w:hAnsi="Calibri" w:cs="Calibri"/>
+          <w:rFonts w:ascii="Carlito" w:hAnsi="Carlito" w:cs="Carlito"/>
           <w:sz w:val="34"/>
           <w:szCs w:val="34"/>
         </w:rPr>
@@ -3047,7 +3087,7 @@
       </w:r>
       <w:r>
         <w:rPr>
-          <w:rFonts w:ascii="Calibri" w:hAnsi="Calibri" w:cs="Calibri"/>
+          <w:rFonts w:ascii="Carlito" w:hAnsi="Carlito" w:cs="Carlito"/>
           <w:b/>
           <w:bCs/>
           <w:sz w:val="34"/>
@@ -3057,7 +3097,7 @@
       </w:r>
       <w:r>
         <w:rPr>
-          <w:rFonts w:ascii="Calibri" w:hAnsi="Calibri" w:cs="Calibri"/>
+          <w:rFonts w:ascii="Carlito" w:hAnsi="Carlito" w:cs="Carlito"/>
           <w:sz w:val="34"/>
           <w:szCs w:val="34"/>
         </w:rPr>
@@ -3065,7 +3105,7 @@
       </w:r>
       <w:r>
         <w:rPr>
-          <w:rFonts w:ascii="Calibri" w:hAnsi="Calibri" w:cs="Calibri"/>
+          <w:rFonts w:ascii="Carlito" w:hAnsi="Carlito" w:cs="Carlito"/>
           <w:b/>
           <w:bCs/>
           <w:sz w:val="34"/>
@@ -3075,7 +3115,7 @@
       </w:r>
       <w:r>
         <w:rPr>
-          <w:rFonts w:ascii="Calibri" w:hAnsi="Calibri" w:cs="Calibri"/>
+          <w:rFonts w:ascii="Carlito" w:hAnsi="Carlito" w:cs="Carlito"/>
           <w:sz w:val="34"/>
           <w:szCs w:val="34"/>
         </w:rPr>
@@ -3083,7 +3123,7 @@
       </w:r>
       <w:r>
         <w:rPr>
-          <w:rFonts w:ascii="Calibri" w:hAnsi="Calibri" w:cs="Calibri"/>
+          <w:rFonts w:ascii="Carlito" w:hAnsi="Carlito" w:cs="Carlito"/>
           <w:b/>
           <w:bCs/>
           <w:sz w:val="34"/>
@@ -3097,17 +3137,17 @@
         <w:spacing w:line="240" w:lineRule="auto"/>
         <w:jc w:val="both"/>
         <w:rPr>
-          <w:rFonts w:ascii="Calibri" w:hAnsi="Calibri" w:cs="Calibri"/>
-          <w:b/>
-          <w:bCs/>
-          <w:color w:val="D86DCB" w:themeColor="accent5" w:themeTint="99"/>
-          <w:sz w:val="34"/>
-          <w:szCs w:val="34"/>
-        </w:rPr>
-      </w:pPr>
-      <w:r>
-        <w:rPr>
-          <w:rFonts w:ascii="Calibri" w:hAnsi="Calibri" w:cs="Calibri"/>
+          <w:rFonts w:ascii="Carlito" w:hAnsi="Carlito" w:cs="Carlito"/>
+          <w:b/>
+          <w:bCs/>
+          <w:color w:val="D86DCB" w:themeColor="accent5" w:themeTint="99"/>
+          <w:sz w:val="34"/>
+          <w:szCs w:val="34"/>
+        </w:rPr>
+      </w:pPr>
+      <w:r>
+        <w:rPr>
+          <w:rFonts w:ascii="Carlito" w:hAnsi="Carlito" w:cs="Carlito"/>
           <w:b/>
           <w:bCs/>
           <w:color w:val="D86DCB" w:themeColor="accent5" w:themeTint="99"/>
@@ -3122,17 +3162,17 @@
         <w:spacing w:line="240" w:lineRule="auto"/>
         <w:jc w:val="both"/>
         <w:rPr>
-          <w:rFonts w:ascii="Calibri" w:hAnsi="Calibri" w:cs="Calibri"/>
-          <w:b/>
-          <w:bCs/>
-          <w:color w:val="D86DCB" w:themeColor="accent5" w:themeTint="99"/>
-          <w:sz w:val="34"/>
-          <w:szCs w:val="34"/>
-        </w:rPr>
-      </w:pPr>
-      <w:r>
-        <w:rPr>
-          <w:rFonts w:ascii="Calibri" w:hAnsi="Calibri" w:cs="Calibri"/>
+          <w:rFonts w:ascii="Carlito" w:hAnsi="Carlito" w:cs="Carlito"/>
+          <w:b/>
+          <w:bCs/>
+          <w:color w:val="D86DCB" w:themeColor="accent5" w:themeTint="99"/>
+          <w:sz w:val="34"/>
+          <w:szCs w:val="34"/>
+        </w:rPr>
+      </w:pPr>
+      <w:r>
+        <w:rPr>
+          <w:rFonts w:ascii="Carlito" w:hAnsi="Carlito" w:cs="Carlito"/>
           <w:b/>
           <w:bCs/>
           <w:color w:val="D86DCB" w:themeColor="accent5" w:themeTint="99"/>
@@ -3147,17 +3187,17 @@
         <w:spacing w:line="240" w:lineRule="auto"/>
         <w:jc w:val="both"/>
         <w:rPr>
-          <w:rFonts w:ascii="Calibri" w:hAnsi="Calibri" w:cs="Calibri"/>
-          <w:b/>
-          <w:bCs/>
-          <w:color w:val="D86DCB" w:themeColor="accent5" w:themeTint="99"/>
-          <w:sz w:val="34"/>
-          <w:szCs w:val="34"/>
-        </w:rPr>
-      </w:pPr>
-      <w:r>
-        <w:rPr>
-          <w:rFonts w:ascii="Calibri" w:hAnsi="Calibri" w:cs="Calibri"/>
+          <w:rFonts w:ascii="Carlito" w:hAnsi="Carlito" w:cs="Carlito"/>
+          <w:b/>
+          <w:bCs/>
+          <w:color w:val="D86DCB" w:themeColor="accent5" w:themeTint="99"/>
+          <w:sz w:val="34"/>
+          <w:szCs w:val="34"/>
+        </w:rPr>
+      </w:pPr>
+      <w:r>
+        <w:rPr>
+          <w:rFonts w:ascii="Carlito" w:hAnsi="Carlito" w:cs="Carlito"/>
           <w:b/>
           <w:bCs/>
           <w:color w:val="D86DCB" w:themeColor="accent5" w:themeTint="99"/>
@@ -3173,25 +3213,25 @@
         <w:spacing w:line="240" w:lineRule="auto"/>
         <w:jc w:val="both"/>
         <w:rPr>
-          <w:rFonts w:ascii="Calibri" w:hAnsi="Calibri" w:cs="Calibri"/>
-          <w:sz w:val="34"/>
-          <w:szCs w:val="34"/>
-        </w:rPr>
-      </w:pPr>
-    </w:p>
-    <w:p>
-      <w:pPr>
-        <w:spacing w:line="240" w:lineRule="auto"/>
-        <w:jc w:val="both"/>
-        <w:rPr>
-          <w:rFonts w:ascii="Calibri" w:hAnsi="Calibri" w:cs="Calibri"/>
-          <w:sz w:val="34"/>
-          <w:szCs w:val="34"/>
-        </w:rPr>
-      </w:pPr>
-      <w:r>
-        <w:rPr>
-          <w:rFonts w:ascii="Calibri" w:hAnsi="Calibri" w:cs="Calibri"/>
+          <w:rFonts w:ascii="Carlito" w:hAnsi="Carlito" w:cs="Carlito"/>
+          <w:sz w:val="34"/>
+          <w:szCs w:val="34"/>
+        </w:rPr>
+      </w:pPr>
+    </w:p>
+    <w:p>
+      <w:pPr>
+        <w:spacing w:line="240" w:lineRule="auto"/>
+        <w:jc w:val="both"/>
+        <w:rPr>
+          <w:rFonts w:ascii="Carlito" w:hAnsi="Carlito" w:cs="Carlito"/>
+          <w:sz w:val="34"/>
+          <w:szCs w:val="34"/>
+        </w:rPr>
+      </w:pPr>
+      <w:r>
+        <w:rPr>
+          <w:rFonts w:ascii="Carlito" w:hAnsi="Carlito" w:cs="Carlito"/>
           <w:sz w:val="34"/>
           <w:szCs w:val="34"/>
         </w:rPr>
@@ -3203,14 +3243,14 @@
         <w:spacing w:line="240" w:lineRule="auto"/>
         <w:jc w:val="both"/>
         <w:rPr>
-          <w:rFonts w:ascii="Calibri" w:hAnsi="Calibri" w:cs="Calibri"/>
-          <w:sz w:val="34"/>
-          <w:szCs w:val="34"/>
-        </w:rPr>
-      </w:pPr>
-      <w:r>
-        <w:rPr>
-          <w:rFonts w:ascii="Calibri" w:hAnsi="Calibri" w:cs="Calibri"/>
+          <w:rFonts w:ascii="Carlito" w:hAnsi="Carlito" w:cs="Carlito"/>
+          <w:sz w:val="34"/>
+          <w:szCs w:val="34"/>
+        </w:rPr>
+      </w:pPr>
+      <w:r>
+        <w:rPr>
+          <w:rFonts w:ascii="Carlito" w:hAnsi="Carlito" w:cs="Carlito"/>
           <w:sz w:val="34"/>
           <w:szCs w:val="34"/>
         </w:rPr>
@@ -3218,7 +3258,7 @@
       </w:r>
       <w:r>
         <w:rPr>
-          <w:rFonts w:ascii="Calibri" w:hAnsi="Calibri" w:cs="Calibri"/>
+          <w:rFonts w:ascii="Carlito" w:hAnsi="Carlito" w:cs="Carlito"/>
           <w:b/>
           <w:bCs/>
           <w:sz w:val="34"/>
@@ -3228,7 +3268,7 @@
       </w:r>
       <w:r>
         <w:rPr>
-          <w:rFonts w:ascii="Calibri" w:hAnsi="Calibri" w:cs="Calibri"/>
+          <w:rFonts w:ascii="Carlito" w:hAnsi="Carlito" w:cs="Carlito"/>
           <w:sz w:val="34"/>
           <w:szCs w:val="34"/>
         </w:rPr>
@@ -3245,14 +3285,14 @@
         <w:spacing w:line="240" w:lineRule="auto"/>
         <w:jc w:val="both"/>
         <w:rPr>
-          <w:rFonts w:ascii="Calibri" w:hAnsi="Calibri" w:cs="Calibri"/>
-          <w:sz w:val="34"/>
-          <w:szCs w:val="34"/>
-        </w:rPr>
-      </w:pPr>
-      <w:r>
-        <w:rPr>
-          <w:rFonts w:ascii="Calibri" w:hAnsi="Calibri" w:cs="Calibri"/>
+          <w:rFonts w:ascii="Carlito" w:hAnsi="Carlito" w:cs="Carlito"/>
+          <w:sz w:val="34"/>
+          <w:szCs w:val="34"/>
+        </w:rPr>
+      </w:pPr>
+      <w:r>
+        <w:rPr>
+          <w:rFonts w:ascii="Carlito" w:hAnsi="Carlito" w:cs="Carlito"/>
           <w:b/>
           <w:bCs/>
           <w:sz w:val="34"/>
@@ -3262,7 +3302,7 @@
       </w:r>
       <w:r>
         <w:rPr>
-          <w:rFonts w:ascii="Calibri" w:hAnsi="Calibri" w:cs="Calibri"/>
+          <w:rFonts w:ascii="Carlito" w:hAnsi="Carlito" w:cs="Carlito"/>
           <w:sz w:val="34"/>
           <w:szCs w:val="34"/>
         </w:rPr>
@@ -3270,7 +3310,7 @@
       </w:r>
       <w:r>
         <w:rPr>
-          <w:rFonts w:ascii="Calibri" w:hAnsi="Calibri" w:cs="Calibri"/>
+          <w:rFonts w:ascii="Carlito" w:hAnsi="Carlito" w:cs="Carlito"/>
           <w:b/>
           <w:bCs/>
           <w:sz w:val="34"/>
@@ -3280,7 +3320,7 @@
       </w:r>
       <w:r>
         <w:rPr>
-          <w:rFonts w:ascii="Calibri" w:hAnsi="Calibri" w:cs="Calibri"/>
+          <w:rFonts w:ascii="Carlito" w:hAnsi="Carlito" w:cs="Carlito"/>
           <w:sz w:val="34"/>
           <w:szCs w:val="34"/>
         </w:rPr>
@@ -3288,7 +3328,7 @@
       </w:r>
       <w:r>
         <w:rPr>
-          <w:rFonts w:ascii="Calibri" w:hAnsi="Calibri" w:cs="Calibri"/>
+          <w:rFonts w:ascii="Carlito" w:hAnsi="Carlito" w:cs="Carlito"/>
           <w:b/>
           <w:bCs/>
           <w:sz w:val="34"/>
@@ -3298,7 +3338,7 @@
       </w:r>
       <w:r>
         <w:rPr>
-          <w:rFonts w:ascii="Calibri" w:hAnsi="Calibri" w:cs="Calibri"/>
+          <w:rFonts w:ascii="Carlito" w:hAnsi="Carlito" w:cs="Carlito"/>
           <w:sz w:val="34"/>
           <w:szCs w:val="34"/>
         </w:rPr>
@@ -3315,14 +3355,14 @@
         <w:spacing w:line="240" w:lineRule="auto"/>
         <w:jc w:val="both"/>
         <w:rPr>
-          <w:rFonts w:ascii="Calibri" w:hAnsi="Calibri" w:cs="Calibri"/>
-          <w:sz w:val="34"/>
-          <w:szCs w:val="34"/>
-        </w:rPr>
-      </w:pPr>
-      <w:r>
-        <w:rPr>
-          <w:rFonts w:ascii="Calibri" w:hAnsi="Calibri" w:cs="Calibri"/>
+          <w:rFonts w:ascii="Carlito" w:hAnsi="Carlito" w:cs="Carlito"/>
+          <w:sz w:val="34"/>
+          <w:szCs w:val="34"/>
+        </w:rPr>
+      </w:pPr>
+      <w:r>
+        <w:rPr>
+          <w:rFonts w:ascii="Carlito" w:hAnsi="Carlito" w:cs="Carlito"/>
           <w:sz w:val="34"/>
           <w:szCs w:val="34"/>
         </w:rPr>
@@ -3330,7 +3370,7 @@
       </w:r>
       <w:r>
         <w:rPr>
-          <w:rFonts w:ascii="Calibri" w:hAnsi="Calibri" w:cs="Calibri"/>
+          <w:rFonts w:ascii="Carlito" w:hAnsi="Carlito" w:cs="Carlito"/>
           <w:b/>
           <w:bCs/>
           <w:sz w:val="34"/>
@@ -3340,7 +3380,7 @@
       </w:r>
       <w:r>
         <w:rPr>
-          <w:rFonts w:ascii="Calibri" w:hAnsi="Calibri" w:cs="Calibri"/>
+          <w:rFonts w:ascii="Carlito" w:hAnsi="Carlito" w:cs="Carlito"/>
           <w:sz w:val="34"/>
           <w:szCs w:val="34"/>
         </w:rPr>
@@ -3357,14 +3397,14 @@
         <w:spacing w:line="240" w:lineRule="auto"/>
         <w:jc w:val="both"/>
         <w:rPr>
-          <w:rFonts w:ascii="Calibri" w:hAnsi="Calibri" w:cs="Calibri"/>
-          <w:sz w:val="34"/>
-          <w:szCs w:val="34"/>
-        </w:rPr>
-      </w:pPr>
-      <w:r>
-        <w:rPr>
-          <w:rFonts w:ascii="Calibri" w:hAnsi="Calibri" w:cs="Calibri"/>
+          <w:rFonts w:ascii="Carlito" w:hAnsi="Carlito" w:cs="Carlito"/>
+          <w:sz w:val="34"/>
+          <w:szCs w:val="34"/>
+        </w:rPr>
+      </w:pPr>
+      <w:r>
+        <w:rPr>
+          <w:rFonts w:ascii="Carlito" w:hAnsi="Carlito" w:cs="Carlito"/>
           <w:sz w:val="34"/>
           <w:szCs w:val="34"/>
         </w:rPr>
@@ -3372,7 +3412,7 @@
       </w:r>
       <w:r>
         <w:rPr>
-          <w:rFonts w:ascii="Calibri" w:hAnsi="Calibri" w:cs="Calibri"/>
+          <w:rFonts w:ascii="Carlito" w:hAnsi="Carlito" w:cs="Carlito"/>
           <w:b/>
           <w:bCs/>
           <w:sz w:val="34"/>
@@ -3382,7 +3422,7 @@
       </w:r>
       <w:r>
         <w:rPr>
-          <w:rFonts w:ascii="Calibri" w:hAnsi="Calibri" w:cs="Calibri"/>
+          <w:rFonts w:ascii="Carlito" w:hAnsi="Carlito" w:cs="Carlito"/>
           <w:sz w:val="34"/>
           <w:szCs w:val="34"/>
         </w:rPr>
@@ -3390,7 +3430,7 @@
       </w:r>
       <w:r>
         <w:rPr>
-          <w:rFonts w:ascii="Calibri" w:hAnsi="Calibri" w:cs="Calibri"/>
+          <w:rFonts w:ascii="Carlito" w:hAnsi="Carlito" w:cs="Carlito"/>
           <w:b/>
           <w:bCs/>
           <w:sz w:val="34"/>
@@ -3400,7 +3440,7 @@
       </w:r>
       <w:r>
         <w:rPr>
-          <w:rFonts w:ascii="Calibri" w:hAnsi="Calibri" w:cs="Calibri"/>
+          <w:rFonts w:ascii="Carlito" w:hAnsi="Carlito" w:cs="Carlito"/>
           <w:sz w:val="34"/>
           <w:szCs w:val="34"/>
         </w:rPr>
@@ -3408,7 +3448,7 @@
       </w:r>
       <w:r>
         <w:rPr>
-          <w:rFonts w:ascii="Calibri" w:hAnsi="Calibri" w:cs="Calibri"/>
+          <w:rFonts w:ascii="Carlito" w:hAnsi="Carlito" w:cs="Carlito"/>
           <w:b/>
           <w:bCs/>
           <w:sz w:val="34"/>
@@ -3418,7 +3458,7 @@
       </w:r>
       <w:r>
         <w:rPr>
-          <w:rFonts w:ascii="Calibri" w:hAnsi="Calibri" w:cs="Calibri"/>
+          <w:rFonts w:ascii="Carlito" w:hAnsi="Carlito" w:cs="Carlito"/>
           <w:sz w:val="34"/>
           <w:szCs w:val="34"/>
         </w:rPr>
@@ -3426,7 +3466,7 @@
       </w:r>
       <w:r>
         <w:rPr>
-          <w:rFonts w:ascii="Calibri" w:hAnsi="Calibri" w:cs="Calibri"/>
+          <w:rFonts w:ascii="Carlito" w:hAnsi="Carlito" w:cs="Carlito"/>
           <w:b/>
           <w:bCs/>
           <w:sz w:val="34"/>
@@ -3440,17 +3480,17 @@
         <w:spacing w:line="240" w:lineRule="auto"/>
         <w:jc w:val="both"/>
         <w:rPr>
-          <w:rFonts w:ascii="Calibri" w:hAnsi="Calibri" w:cs="Calibri"/>
-          <w:b/>
-          <w:bCs/>
-          <w:color w:val="D86DCB" w:themeColor="accent5" w:themeTint="99"/>
-          <w:sz w:val="34"/>
-          <w:szCs w:val="34"/>
-        </w:rPr>
-      </w:pPr>
-      <w:r>
-        <w:rPr>
-          <w:rFonts w:ascii="Calibri" w:hAnsi="Calibri" w:cs="Calibri"/>
+          <w:rFonts w:ascii="Carlito" w:hAnsi="Carlito" w:cs="Carlito"/>
+          <w:b/>
+          <w:bCs/>
+          <w:color w:val="D86DCB" w:themeColor="accent5" w:themeTint="99"/>
+          <w:sz w:val="34"/>
+          <w:szCs w:val="34"/>
+        </w:rPr>
+      </w:pPr>
+      <w:r>
+        <w:rPr>
+          <w:rFonts w:ascii="Carlito" w:hAnsi="Carlito" w:cs="Carlito"/>
           <w:b/>
           <w:bCs/>
           <w:color w:val="D86DCB" w:themeColor="accent5" w:themeTint="99"/>
@@ -3465,14 +3505,14 @@
         <w:spacing w:line="240" w:lineRule="auto"/>
         <w:jc w:val="both"/>
         <w:rPr>
-          <w:rFonts w:ascii="Calibri" w:hAnsi="Calibri" w:cs="Calibri"/>
-          <w:sz w:val="34"/>
-          <w:szCs w:val="34"/>
-        </w:rPr>
-      </w:pPr>
-      <w:r>
-        <w:rPr>
-          <w:rFonts w:ascii="Calibri" w:hAnsi="Calibri" w:cs="Calibri"/>
+          <w:rFonts w:ascii="Carlito" w:hAnsi="Carlito" w:cs="Carlito"/>
+          <w:sz w:val="34"/>
+          <w:szCs w:val="34"/>
+        </w:rPr>
+      </w:pPr>
+      <w:r>
+        <w:rPr>
+          <w:rFonts w:ascii="Carlito" w:hAnsi="Carlito" w:cs="Carlito"/>
           <w:sz w:val="34"/>
           <w:szCs w:val="34"/>
         </w:rPr>
@@ -3484,17 +3524,17 @@
         <w:spacing w:line="240" w:lineRule="auto"/>
         <w:jc w:val="both"/>
         <w:rPr>
-          <w:rFonts w:ascii="Calibri" w:hAnsi="Calibri" w:cs="Calibri"/>
-          <w:b/>
-          <w:bCs/>
-          <w:color w:val="D86DCB" w:themeColor="accent5" w:themeTint="99"/>
-          <w:sz w:val="34"/>
-          <w:szCs w:val="34"/>
-        </w:rPr>
-      </w:pPr>
-      <w:r>
-        <w:rPr>
-          <w:rFonts w:ascii="Calibri" w:hAnsi="Calibri" w:cs="Calibri"/>
+          <w:rFonts w:ascii="Carlito" w:hAnsi="Carlito" w:cs="Carlito"/>
+          <w:b/>
+          <w:bCs/>
+          <w:color w:val="D86DCB" w:themeColor="accent5" w:themeTint="99"/>
+          <w:sz w:val="34"/>
+          <w:szCs w:val="34"/>
+        </w:rPr>
+      </w:pPr>
+      <w:r>
+        <w:rPr>
+          <w:rFonts w:ascii="Carlito" w:hAnsi="Carlito" w:cs="Carlito"/>
           <w:b/>
           <w:bCs/>
           <w:color w:val="D86DCB" w:themeColor="accent5" w:themeTint="99"/>
@@ -3509,17 +3549,17 @@
         <w:spacing w:line="240" w:lineRule="auto"/>
         <w:jc w:val="both"/>
         <w:rPr>
-          <w:rFonts w:ascii="Calibri" w:hAnsi="Calibri" w:cs="Calibri"/>
-          <w:b/>
-          <w:bCs/>
-          <w:color w:val="D86DCB" w:themeColor="accent5" w:themeTint="99"/>
-          <w:sz w:val="34"/>
-          <w:szCs w:val="34"/>
-        </w:rPr>
-      </w:pPr>
-      <w:r>
-        <w:rPr>
-          <w:rFonts w:ascii="Calibri" w:hAnsi="Calibri" w:cs="Calibri"/>
+          <w:rFonts w:ascii="Carlito" w:hAnsi="Carlito" w:cs="Carlito"/>
+          <w:b/>
+          <w:bCs/>
+          <w:color w:val="D86DCB" w:themeColor="accent5" w:themeTint="99"/>
+          <w:sz w:val="34"/>
+          <w:szCs w:val="34"/>
+        </w:rPr>
+      </w:pPr>
+      <w:r>
+        <w:rPr>
+          <w:rFonts w:ascii="Carlito" w:hAnsi="Carlito" w:cs="Carlito"/>
           <w:b/>
           <w:bCs/>
           <w:color w:val="D86DCB" w:themeColor="accent5" w:themeTint="99"/>
@@ -3534,17 +3574,17 @@
         <w:spacing w:line="240" w:lineRule="auto"/>
         <w:jc w:val="both"/>
         <w:rPr>
-          <w:rFonts w:ascii="Calibri" w:hAnsi="Calibri" w:cs="Calibri"/>
-          <w:b/>
-          <w:bCs/>
-          <w:color w:val="D86DCB" w:themeColor="accent5" w:themeTint="99"/>
-          <w:sz w:val="34"/>
-          <w:szCs w:val="34"/>
-        </w:rPr>
-      </w:pPr>
-      <w:r>
-        <w:rPr>
-          <w:rFonts w:ascii="Calibri" w:hAnsi="Calibri" w:cs="Calibri"/>
+          <w:rFonts w:ascii="Carlito" w:hAnsi="Carlito" w:cs="Carlito"/>
+          <w:b/>
+          <w:bCs/>
+          <w:color w:val="D86DCB" w:themeColor="accent5" w:themeTint="99"/>
+          <w:sz w:val="34"/>
+          <w:szCs w:val="34"/>
+        </w:rPr>
+      </w:pPr>
+      <w:r>
+        <w:rPr>
+          <w:rFonts w:ascii="Carlito" w:hAnsi="Carlito" w:cs="Carlito"/>
           <w:b/>
           <w:bCs/>
           <w:color w:val="D86DCB" w:themeColor="accent5" w:themeTint="99"/>
@@ -3559,25 +3599,25 @@
         <w:spacing w:line="240" w:lineRule="auto"/>
         <w:jc w:val="both"/>
         <w:rPr>
-          <w:rFonts w:ascii="Calibri" w:hAnsi="Calibri" w:cs="Calibri"/>
-          <w:sz w:val="34"/>
-          <w:szCs w:val="34"/>
-        </w:rPr>
-      </w:pPr>
-    </w:p>
-    <w:p>
-      <w:pPr>
-        <w:spacing w:line="240" w:lineRule="auto"/>
-        <w:jc w:val="both"/>
-        <w:rPr>
-          <w:rFonts w:ascii="Calibri" w:hAnsi="Calibri" w:cs="Calibri"/>
-          <w:sz w:val="34"/>
-          <w:szCs w:val="34"/>
-        </w:rPr>
-      </w:pPr>
-      <w:r>
-        <w:rPr>
-          <w:rFonts w:ascii="Calibri" w:hAnsi="Calibri" w:cs="Calibri"/>
+          <w:rFonts w:ascii="Carlito" w:hAnsi="Carlito" w:cs="Carlito"/>
+          <w:sz w:val="34"/>
+          <w:szCs w:val="34"/>
+        </w:rPr>
+      </w:pPr>
+    </w:p>
+    <w:p>
+      <w:pPr>
+        <w:spacing w:line="240" w:lineRule="auto"/>
+        <w:jc w:val="both"/>
+        <w:rPr>
+          <w:rFonts w:ascii="Carlito" w:hAnsi="Carlito" w:cs="Carlito"/>
+          <w:sz w:val="34"/>
+          <w:szCs w:val="34"/>
+        </w:rPr>
+      </w:pPr>
+      <w:r>
+        <w:rPr>
+          <w:rFonts w:ascii="Carlito" w:hAnsi="Carlito" w:cs="Carlito"/>
           <w:sz w:val="34"/>
           <w:szCs w:val="34"/>
         </w:rPr>
@@ -3589,14 +3629,14 @@
         <w:spacing w:line="240" w:lineRule="auto"/>
         <w:jc w:val="both"/>
         <w:rPr>
-          <w:rFonts w:ascii="Calibri" w:hAnsi="Calibri" w:cs="Calibri"/>
-          <w:sz w:val="34"/>
-          <w:szCs w:val="34"/>
-        </w:rPr>
-      </w:pPr>
-      <w:r>
-        <w:rPr>
-          <w:rFonts w:ascii="Calibri" w:hAnsi="Calibri" w:cs="Calibri"/>
+          <w:rFonts w:ascii="Carlito" w:hAnsi="Carlito" w:cs="Carlito"/>
+          <w:sz w:val="34"/>
+          <w:szCs w:val="34"/>
+        </w:rPr>
+      </w:pPr>
+      <w:r>
+        <w:rPr>
+          <w:rFonts w:ascii="Carlito" w:hAnsi="Carlito" w:cs="Carlito"/>
           <w:sz w:val="34"/>
           <w:szCs w:val="34"/>
         </w:rPr>
@@ -3604,7 +3644,7 @@
       </w:r>
       <w:r>
         <w:rPr>
-          <w:rFonts w:ascii="Calibri" w:hAnsi="Calibri" w:cs="Calibri"/>
+          <w:rFonts w:ascii="Carlito" w:hAnsi="Carlito" w:cs="Carlito"/>
           <w:b/>
           <w:bCs/>
           <w:sz w:val="34"/>
@@ -3614,7 +3654,7 @@
       </w:r>
       <w:r>
         <w:rPr>
-          <w:rFonts w:ascii="Calibri" w:hAnsi="Calibri" w:cs="Calibri"/>
+          <w:rFonts w:ascii="Carlito" w:hAnsi="Carlito" w:cs="Carlito"/>
           <w:sz w:val="34"/>
           <w:szCs w:val="34"/>
         </w:rPr>
@@ -3631,14 +3671,14 @@
         <w:spacing w:line="240" w:lineRule="auto"/>
         <w:jc w:val="both"/>
         <w:rPr>
-          <w:rFonts w:ascii="Calibri" w:hAnsi="Calibri" w:cs="Calibri"/>
-          <w:sz w:val="34"/>
-          <w:szCs w:val="34"/>
-        </w:rPr>
-      </w:pPr>
-      <w:r>
-        <w:rPr>
-          <w:rFonts w:ascii="Calibri" w:hAnsi="Calibri" w:cs="Calibri"/>
+          <w:rFonts w:ascii="Carlito" w:hAnsi="Carlito" w:cs="Carlito"/>
+          <w:sz w:val="34"/>
+          <w:szCs w:val="34"/>
+        </w:rPr>
+      </w:pPr>
+      <w:r>
+        <w:rPr>
+          <w:rFonts w:ascii="Carlito" w:hAnsi="Carlito" w:cs="Carlito"/>
           <w:sz w:val="34"/>
           <w:szCs w:val="34"/>
         </w:rPr>
@@ -3655,14 +3695,14 @@
         <w:spacing w:line="240" w:lineRule="auto"/>
         <w:jc w:val="both"/>
         <w:rPr>
-          <w:rFonts w:ascii="Calibri" w:hAnsi="Calibri" w:cs="Calibri"/>
-          <w:sz w:val="34"/>
-          <w:szCs w:val="34"/>
-        </w:rPr>
-      </w:pPr>
-      <w:r>
-        <w:rPr>
-          <w:rFonts w:ascii="Calibri" w:hAnsi="Calibri" w:cs="Calibri"/>
+          <w:rFonts w:ascii="Carlito" w:hAnsi="Carlito" w:cs="Carlito"/>
+          <w:sz w:val="34"/>
+          <w:szCs w:val="34"/>
+        </w:rPr>
+      </w:pPr>
+      <w:r>
+        <w:rPr>
+          <w:rFonts w:ascii="Carlito" w:hAnsi="Carlito" w:cs="Carlito"/>
           <w:sz w:val="34"/>
           <w:szCs w:val="34"/>
         </w:rPr>
@@ -3674,17 +3714,17 @@
         <w:spacing w:line="240" w:lineRule="auto"/>
         <w:jc w:val="both"/>
         <w:rPr>
-          <w:rFonts w:ascii="Calibri" w:hAnsi="Calibri" w:cs="Calibri"/>
-          <w:sz w:val="34"/>
-          <w:szCs w:val="34"/>
-        </w:rPr>
-      </w:pPr>
-    </w:p>
-    <w:p>
-      <w:pPr>
-        <w:jc w:val="both"/>
-        <w:rPr>
-          <w:rFonts w:ascii="Calibri" w:hAnsi="Calibri" w:cs="Calibri"/>
+          <w:rFonts w:ascii="Carlito" w:hAnsi="Carlito" w:cs="Carlito"/>
+          <w:sz w:val="34"/>
+          <w:szCs w:val="34"/>
+        </w:rPr>
+      </w:pPr>
+    </w:p>
+    <w:p>
+      <w:pPr>
+        <w:jc w:val="both"/>
+        <w:rPr>
+          <w:rFonts w:ascii="Carlito" w:hAnsi="Carlito" w:cs="Carlito"/>
           <w:sz w:val="34"/>
           <w:szCs w:val="34"/>
         </w:rPr>

</xml_diff>